<commit_message>
feat(back-operations): add driver photo and fingerprint to the contract
</commit_message>
<xml_diff>
--- a/ProjectPanamaBackend/documents/ContratoOriginal_ConCupo_0010.docx
+++ b/ProjectPanamaBackend/documents/ContratoOriginal_ConCupo_0010.docx
@@ -1,6 +1,6 @@
 
 <file path=word/document.xml><?xml version="1.0" encoding="utf-8"?>
-<w:document xmlns:wpc="http://schemas.microsoft.com/office/word/2010/wordprocessingCanvas" xmlns:cx="http://schemas.microsoft.com/office/drawing/2014/chartex" xmlns:cx1="http://schemas.microsoft.com/office/drawing/2015/9/8/chartex" xmlns:cx2="http://schemas.microsoft.com/office/drawing/2015/10/21/chartex" xmlns:cx3="http://schemas.microsoft.com/office/drawing/2016/5/9/chartex" xmlns:cx4="http://schemas.microsoft.com/office/drawing/2016/5/10/chartex" xmlns:cx5="http://schemas.microsoft.com/office/drawing/2016/5/11/chartex" xmlns:cx6="http://schemas.microsoft.com/office/drawing/2016/5/12/chartex" xmlns:cx7="http://schemas.microsoft.com/office/drawing/2016/5/13/chartex" xmlns:cx8="http://schemas.microsoft.com/office/drawing/2016/5/14/chartex" xmlns:mc="http://schemas.openxmlformats.org/markup-compatibility/2006" xmlns:aink="http://schemas.microsoft.com/office/drawing/2016/ink" xmlns:am3d="http://schemas.microsoft.com/office/drawing/2017/model3d" xmlns:o="urn:schemas-microsoft-com:office:office" xmlns:oel="http://schemas.microsoft.com/office/2019/extlst" xmlns:r="http://schemas.openxmlformats.org/officeDocument/2006/relationships" xmlns:m="http://schemas.openxmlformats.org/officeDocument/2006/math" xmlns:v="urn:schemas-microsoft-com:vml" xmlns:wp14="http://schemas.microsoft.com/office/word/2010/wordprocessingDrawing" xmlns:wp="http://schemas.openxmlformats.org/drawingml/2006/wordprocessingDrawing" xmlns:w10="urn:schemas-microsoft-com:office:word" xmlns:w="http://schemas.openxmlformats.org/wordprocessingml/2006/main" xmlns:w14="http://schemas.microsoft.com/office/word/2010/wordml" xmlns:w15="http://schemas.microsoft.com/office/word/2012/wordml" xmlns:w16cex="http://schemas.microsoft.com/office/word/2018/wordml/cex" xmlns:w16cid="http://schemas.microsoft.com/office/word/2016/wordml/cid" xmlns:w16="http://schemas.microsoft.com/office/word/2018/wordml" xmlns:w16du="http://schemas.microsoft.com/office/word/2023/wordml/word16du" xmlns:w16sdtdh="http://schemas.microsoft.com/office/word/2020/wordml/sdtdatahash" xmlns:w16sdtfl="http://schemas.microsoft.com/office/word/2024/wordml/sdtformatlock" xmlns:w16se="http://schemas.microsoft.com/office/word/2015/wordml/symex" xmlns:wpg="http://schemas.microsoft.com/office/word/2010/wordprocessingGroup" xmlns:wpi="http://schemas.microsoft.com/office/word/2010/wordprocessingInk" xmlns:wne="http://schemas.microsoft.com/office/word/2006/wordml" xmlns:wps="http://schemas.microsoft.com/office/word/2010/wordprocessingShape" mc:Ignorable="w14 w15 w16se w16cid w16 w16cex w16sdtdh w16sdtfl w16du wp14">
+<w:document xmlns:wpc="http://schemas.microsoft.com/office/word/2010/wordprocessingCanvas" xmlns:cx="http://schemas.microsoft.com/office/drawing/2014/chartex" xmlns:cx1="http://schemas.microsoft.com/office/drawing/2015/9/8/chartex" xmlns:cx2="http://schemas.microsoft.com/office/drawing/2015/10/21/chartex" xmlns:cx3="http://schemas.microsoft.com/office/drawing/2016/5/9/chartex" xmlns:cx4="http://schemas.microsoft.com/office/drawing/2016/5/10/chartex" xmlns:cx5="http://schemas.microsoft.com/office/drawing/2016/5/11/chartex" xmlns:cx6="http://schemas.microsoft.com/office/drawing/2016/5/12/chartex" xmlns:cx7="http://schemas.microsoft.com/office/drawing/2016/5/13/chartex" xmlns:cx8="http://schemas.microsoft.com/office/drawing/2016/5/14/chartex" xmlns:mc="http://schemas.openxmlformats.org/markup-compatibility/2006" xmlns:aink="http://schemas.microsoft.com/office/drawing/2016/ink" xmlns:am3d="http://schemas.microsoft.com/office/drawing/2017/model3d" xmlns:o="urn:schemas-microsoft-com:office:office" xmlns:oel="http://schemas.microsoft.com/office/2019/extlst" xmlns:r="http://schemas.openxmlformats.org/officeDocument/2006/relationships" xmlns:m="http://schemas.openxmlformats.org/officeDocument/2006/math" xmlns:v="urn:schemas-microsoft-com:vml" xmlns:wp14="http://schemas.microsoft.com/office/word/2010/wordprocessingDrawing" xmlns:wp="http://schemas.openxmlformats.org/drawingml/2006/wordprocessingDrawing" xmlns:w10="urn:schemas-microsoft-com:office:word" xmlns:w="http://schemas.openxmlformats.org/wordprocessingml/2006/main" xmlns:w14="http://schemas.microsoft.com/office/word/2010/wordml" xmlns:w15="http://schemas.microsoft.com/office/word/2012/wordml" xmlns:w16cex="http://schemas.microsoft.com/office/word/2018/wordml/cex" xmlns:w16cid="http://schemas.microsoft.com/office/word/2016/wordml/cid" xmlns:w16="http://schemas.microsoft.com/office/word/2018/wordml" xmlns:w16sdtdh="http://schemas.microsoft.com/office/word/2020/wordml/sdtdatahash" xmlns:w16se="http://schemas.microsoft.com/office/word/2015/wordml/symex" xmlns:wpg="http://schemas.microsoft.com/office/word/2010/wordprocessingGroup" xmlns:wpi="http://schemas.microsoft.com/office/word/2010/wordprocessingInk" xmlns:wne="http://schemas.microsoft.com/office/word/2006/wordml" xmlns:wps="http://schemas.microsoft.com/office/word/2010/wordprocessingShape" mc:Ignorable="w14 w15 w16se w16cid w16 w16cex w16sdtdh wp14">
   <w:body>
     <w:p>
       <w:pPr>
@@ -22,29 +22,7 @@
           <w:szCs w:val="20"/>
           <w:u w:val="single"/>
         </w:rPr>
-        <w:t xml:space="preserve">UNIDAD </w:t>
-      </w:r>
-      <w:proofErr w:type="spellStart"/>
-      <w:r>
-        <w:rPr>
-          <w:rFonts w:ascii="Cambria" w:hAnsi="Cambria"/>
-          <w:b/>
-          <w:sz w:val="20"/>
-          <w:szCs w:val="20"/>
-          <w:u w:val="single"/>
-        </w:rPr>
-        <w:t>N°</w:t>
-      </w:r>
-      <w:proofErr w:type="spellEnd"/>
-      <w:r>
-        <w:rPr>
-          <w:rFonts w:ascii="Cambria" w:hAnsi="Cambria"/>
-          <w:b/>
-          <w:sz w:val="20"/>
-          <w:szCs w:val="20"/>
-          <w:u w:val="single"/>
-        </w:rPr>
-        <w:t xml:space="preserve"> </w:t>
+        <w:t xml:space="preserve">UNIDAD N° </w:t>
       </w:r>
       <w:r>
         <w:rPr>
@@ -55,7 +33,29 @@
           <w:u w:val="single"/>
           <w:lang w:val="es-CO"/>
         </w:rPr>
-        <w:t>{{Unidad}}</w:t>
+        <w:t>{{</w:t>
+      </w:r>
+      <w:r>
+        <w:rPr>
+          <w:rFonts w:ascii="Cambria" w:hAnsi="Cambria"/>
+          <w:b/>
+          <w:sz w:val="20"/>
+          <w:szCs w:val="20"/>
+          <w:u w:val="single"/>
+          <w:lang w:val="es-CO"/>
+        </w:rPr>
+        <w:t>Unidad</w:t>
+      </w:r>
+      <w:r>
+        <w:rPr>
+          <w:rFonts w:ascii="Cambria" w:hAnsi="Cambria"/>
+          <w:b/>
+          <w:sz w:val="20"/>
+          <w:szCs w:val="20"/>
+          <w:u w:val="single"/>
+          <w:lang w:val="es-CO"/>
+        </w:rPr>
+        <w:t>}}</w:t>
       </w:r>
       <w:r>
         <w:rPr>
@@ -92,7 +92,7 @@
           <w:szCs w:val="20"/>
           <w:u w:val="single"/>
         </w:rPr>
-        <w:t xml:space="preserve">         </w:t>
+        <w:t xml:space="preserve">        </w:t>
       </w:r>
       <w:r>
         <w:rPr>
@@ -111,9 +111,8 @@
           <w:szCs w:val="20"/>
           <w:u w:val="single"/>
         </w:rPr>
-        <w:t xml:space="preserve">Operador </w:t>
-      </w:r>
-      <w:proofErr w:type="spellStart"/>
+        <w:t>Operador</w:t>
+      </w:r>
       <w:r>
         <w:rPr>
           <w:rFonts w:ascii="Cambria" w:hAnsi="Cambria"/>
@@ -122,9 +121,8 @@
           <w:szCs w:val="20"/>
           <w:u w:val="single"/>
         </w:rPr>
-        <w:t>N°</w:t>
-      </w:r>
-      <w:proofErr w:type="spellEnd"/>
+        <w:t xml:space="preserve"> </w:t>
+      </w:r>
       <w:r>
         <w:rPr>
           <w:rFonts w:ascii="Cambria" w:hAnsi="Cambria"/>
@@ -133,7 +131,7 @@
           <w:szCs w:val="20"/>
           <w:u w:val="single"/>
         </w:rPr>
-        <w:t xml:space="preserve"> </w:t>
+        <w:t xml:space="preserve">N° </w:t>
       </w:r>
       <w:r>
         <w:rPr>
@@ -1487,7 +1485,27 @@
           <w:szCs w:val="24"/>
           <w:lang w:eastAsia="es-PA"/>
         </w:rPr>
-        <w:t xml:space="preserve"> Cajas de la empresa o cuenta bancaria, Yappy comercial o ARP, designada por LA PROPIETARIA. Estableciéndose el costo adicional de la comisión por transferencia comercial en 0.50 centésimos.</w:t>
+        <w:t xml:space="preserve"> Cajas de la empresa o cuenta bancaria, </w:t>
+      </w:r>
+      <w:proofErr w:type="spellStart"/>
+      <w:r>
+        <w:rPr>
+          <w:rFonts w:ascii="Cambria" w:eastAsia="Times New Roman" w:hAnsi="Cambria" w:cs="Arial"/>
+          <w:sz w:val="24"/>
+          <w:szCs w:val="24"/>
+          <w:lang w:eastAsia="es-PA"/>
+        </w:rPr>
+        <w:t>Yappy</w:t>
+      </w:r>
+      <w:proofErr w:type="spellEnd"/>
+      <w:r>
+        <w:rPr>
+          <w:rFonts w:ascii="Cambria" w:eastAsia="Times New Roman" w:hAnsi="Cambria" w:cs="Arial"/>
+          <w:sz w:val="24"/>
+          <w:szCs w:val="24"/>
+          <w:lang w:eastAsia="es-PA"/>
+        </w:rPr>
+        <w:t xml:space="preserve"> comercial o ARP, designada por LA PROPIETARIA. Estableciéndose el costo adicional de la comisión por transferencia comercial en 0.50 centésimos.</w:t>
       </w:r>
     </w:p>
     <w:p>
@@ -2138,6 +2156,7 @@
           <w:szCs w:val="24"/>
           <w:lang w:eastAsia="es-PA"/>
         </w:rPr>
+        <w:lastRenderedPageBreak/>
         <w:t>NOVENA (Límites de Cobertura de Seguro y Operación):</w:t>
       </w:r>
       <w:r>
@@ -2869,6 +2888,7 @@
           <w:szCs w:val="24"/>
           <w:lang w:eastAsia="es-PA"/>
         </w:rPr>
+        <w:lastRenderedPageBreak/>
         <w:t>DECIMOTERCERA (Uso de Vehículo Sustituto - Separación de Cuentas):</w:t>
       </w:r>
       <w:r>
@@ -3501,7 +3521,6 @@
           <w:szCs w:val="24"/>
           <w:lang w:eastAsia="es-PA"/>
         </w:rPr>
-        <w:lastRenderedPageBreak/>
         <w:t xml:space="preserve">Desconexión o manipulación del GPS. </w:t>
       </w:r>
     </w:p>
@@ -3554,6 +3573,7 @@
           <w:szCs w:val="24"/>
           <w:lang w:eastAsia="es-PA"/>
         </w:rPr>
+        <w:lastRenderedPageBreak/>
         <w:t>Abandono del vehículo por más de 24 horas.</w:t>
       </w:r>
     </w:p>
@@ -4131,7 +4151,36 @@
           <w:szCs w:val="24"/>
           <w:lang w:eastAsia="es-PA"/>
         </w:rPr>
-        <w:t xml:space="preserve"> Si al finalizar el plazo del arrendamiento EL ARRENDATARIO mantuviese saldos pendientes por repuestos, siniestros u otros cargos ("Deuda Residual"), se aplicará el siguiente procedimiento </w:t>
+        <w:t xml:space="preserve"> </w:t>
+      </w:r>
+      <w:proofErr w:type="spellStart"/>
+      <w:r>
+        <w:rPr>
+          <w:rFonts w:ascii="Cambria" w:eastAsia="Times New Roman" w:hAnsi="Cambria" w:cs="Arial"/>
+          <w:sz w:val="24"/>
+          <w:szCs w:val="24"/>
+          <w:lang w:eastAsia="es-PA"/>
+        </w:rPr>
+        <w:t>Si</w:t>
+      </w:r>
+      <w:r>
+        <w:rPr>
+          <w:rFonts w:ascii="Cambria" w:eastAsia="Times New Roman" w:hAnsi="Cambria" w:cs="Arial"/>
+          <w:sz w:val="24"/>
+          <w:szCs w:val="24"/>
+          <w:lang w:eastAsia="es-PA"/>
+        </w:rPr>
+        <w:t>al</w:t>
+      </w:r>
+      <w:proofErr w:type="spellEnd"/>
+      <w:r>
+        <w:rPr>
+          <w:rFonts w:ascii="Cambria" w:eastAsia="Times New Roman" w:hAnsi="Cambria" w:cs="Arial"/>
+          <w:sz w:val="24"/>
+          <w:szCs w:val="24"/>
+          <w:lang w:eastAsia="es-PA"/>
+        </w:rPr>
+        <w:t xml:space="preserve"> finalizar el plazo del arrendamiento EL ARRENDATARIO mantuviese saldos pendientes por repuestos, siniestros u otros cargos ("Deuda Residual"), se aplicará el siguiente procedimiento </w:t>
       </w:r>
       <w:r>
         <w:rPr>
@@ -4176,7 +4225,6 @@
           <w:szCs w:val="24"/>
           <w:lang w:eastAsia="es-PA"/>
         </w:rPr>
-        <w:lastRenderedPageBreak/>
         <w:t>Firma del Acuerdo:</w:t>
       </w:r>
       <w:r>
@@ -4249,6 +4297,7 @@
           <w:szCs w:val="24"/>
           <w:lang w:eastAsia="es-PA"/>
         </w:rPr>
+        <w:lastRenderedPageBreak/>
         <w:t>Mutación de Tenencia:</w:t>
       </w:r>
       <w:r>
@@ -4474,651 +4523,616 @@
         </w:rPr>
       </w:pPr>
     </w:p>
+    <w:tbl>
+      <w:tblPr>
+        <w:tblStyle w:val="TableGrid"/>
+        <w:tblW w:w="0" w:type="auto"/>
+        <w:tblLook w:val="04A0" w:firstRow="1" w:lastRow="0" w:firstColumn="1" w:lastColumn="0" w:noHBand="0" w:noVBand="1"/>
+      </w:tblPr>
+      <w:tblGrid>
+        <w:gridCol w:w="4931"/>
+        <w:gridCol w:w="4429"/>
+      </w:tblGrid>
+      <w:tr>
+        <w:tc>
+          <w:tcPr>
+            <w:tcW w:w="4931" w:type="dxa"/>
+            <w:tcBorders>
+              <w:top w:val="nil"/>
+              <w:left w:val="nil"/>
+              <w:bottom w:val="nil"/>
+              <w:right w:val="nil"/>
+            </w:tcBorders>
+          </w:tcPr>
+          <w:p>
+            <w:pPr>
+              <w:spacing w:after="0" w:line="240" w:lineRule="auto"/>
+              <w:jc w:val="both"/>
+              <w:rPr>
+                <w:rFonts w:ascii="Cambria" w:eastAsia="Times New Roman" w:hAnsi="Cambria" w:cs="Arial"/>
+                <w:noProof/>
+                <w:sz w:val="24"/>
+                <w:szCs w:val="24"/>
+                <w:lang w:eastAsia="es-PA"/>
+              </w:rPr>
+            </w:pPr>
+          </w:p>
+          <w:p>
+            <w:pPr>
+              <w:spacing w:after="0" w:line="240" w:lineRule="auto"/>
+              <w:jc w:val="both"/>
+              <w:rPr>
+                <w:rFonts w:ascii="Cambria" w:eastAsia="Times New Roman" w:hAnsi="Cambria" w:cs="Arial"/>
+                <w:sz w:val="24"/>
+                <w:szCs w:val="24"/>
+                <w:lang w:eastAsia="es-PA"/>
+              </w:rPr>
+            </w:pPr>
+            <w:r>
+              <w:rPr>
+                <w:rFonts w:ascii="Cambria" w:eastAsia="Times New Roman" w:hAnsi="Cambria" w:cs="Arial"/>
+                <w:noProof/>
+                <w:sz w:val="24"/>
+                <w:szCs w:val="24"/>
+                <w:lang w:eastAsia="es-PA"/>
+              </w:rPr>
+              <w:t>{{Firma</w:t>
+            </w:r>
+            <w:r>
+              <w:rPr>
+                <w:rFonts w:ascii="Cambria" w:eastAsia="Times New Roman" w:hAnsi="Cambria" w:cs="Arial"/>
+                <w:noProof/>
+                <w:sz w:val="24"/>
+                <w:szCs w:val="24"/>
+                <w:lang w:eastAsia="es-PA"/>
+              </w:rPr>
+              <w:t>Representa</w:t>
+            </w:r>
+            <w:r>
+              <w:rPr>
+                <w:rFonts w:ascii="Cambria" w:eastAsia="Times New Roman" w:hAnsi="Cambria" w:cs="Arial"/>
+                <w:noProof/>
+                <w:sz w:val="24"/>
+                <w:szCs w:val="24"/>
+                <w:lang w:eastAsia="es-PA"/>
+              </w:rPr>
+              <w:t>}}</w:t>
+            </w:r>
+          </w:p>
+          <w:p>
+            <w:pPr>
+              <w:spacing w:after="0" w:line="240" w:lineRule="auto"/>
+              <w:jc w:val="both"/>
+              <w:rPr>
+                <w:rFonts w:ascii="Cambria" w:eastAsia="Times New Roman" w:hAnsi="Cambria" w:cs="Arial"/>
+                <w:sz w:val="24"/>
+                <w:szCs w:val="24"/>
+                <w:lang w:eastAsia="es-PA"/>
+              </w:rPr>
+            </w:pPr>
+            <w:r>
+              <w:rPr>
+                <w:rFonts w:ascii="Cambria" w:eastAsia="Times New Roman" w:hAnsi="Cambria" w:cs="Arial"/>
+                <w:sz w:val="24"/>
+                <w:szCs w:val="24"/>
+                <w:lang w:eastAsia="es-PA"/>
+              </w:rPr>
+              <w:t>____________________________________________________</w:t>
+            </w:r>
+          </w:p>
+          <w:p>
+            <w:pPr>
+              <w:spacing w:after="0" w:line="240" w:lineRule="auto"/>
+              <w:jc w:val="both"/>
+              <w:rPr>
+                <w:rFonts w:ascii="Cambria" w:eastAsia="Times New Roman" w:hAnsi="Cambria" w:cs="Arial"/>
+                <w:b/>
+                <w:bCs/>
+                <w:sz w:val="24"/>
+                <w:szCs w:val="24"/>
+                <w:lang w:eastAsia="es-PA"/>
+              </w:rPr>
+            </w:pPr>
+            <w:r>
+              <w:rPr>
+                <w:rFonts w:ascii="Cambria" w:hAnsi="Cambria"/>
+                <w:b/>
+                <w:bCs/>
+                <w:sz w:val="24"/>
+                <w:szCs w:val="24"/>
+                <w:lang w:val="es-MX"/>
+              </w:rPr>
+              <w:t>{{</w:t>
+            </w:r>
+            <w:r>
+              <w:rPr>
+                <w:rFonts w:ascii="Cambria" w:hAnsi="Cambria"/>
+                <w:b/>
+                <w:bCs/>
+                <w:sz w:val="24"/>
+                <w:szCs w:val="24"/>
+                <w:lang w:val="es-MX"/>
+              </w:rPr>
+              <w:t>Representa</w:t>
+            </w:r>
+            <w:r>
+              <w:rPr>
+                <w:rFonts w:ascii="Cambria" w:hAnsi="Cambria"/>
+                <w:b/>
+                <w:bCs/>
+                <w:sz w:val="24"/>
+                <w:szCs w:val="24"/>
+                <w:lang w:val="es-MX"/>
+              </w:rPr>
+              <w:t>}}</w:t>
+            </w:r>
+          </w:p>
+          <w:p>
+            <w:pPr>
+              <w:spacing w:after="0" w:line="240" w:lineRule="auto"/>
+              <w:jc w:val="both"/>
+              <w:rPr>
+                <w:rFonts w:ascii="Cambria" w:eastAsia="Times New Roman" w:hAnsi="Cambria" w:cs="Arial"/>
+                <w:b/>
+                <w:bCs/>
+                <w:sz w:val="24"/>
+                <w:szCs w:val="24"/>
+                <w:lang w:eastAsia="es-PA"/>
+              </w:rPr>
+            </w:pPr>
+            <w:r>
+              <w:rPr>
+                <w:rFonts w:ascii="Cambria" w:eastAsia="Times New Roman" w:hAnsi="Cambria" w:cs="Arial"/>
+                <w:sz w:val="24"/>
+                <w:szCs w:val="24"/>
+                <w:lang w:val="es-ES" w:eastAsia="es-PA"/>
+              </w:rPr>
+              <w:t xml:space="preserve">CEDULA: </w:t>
+            </w:r>
+            <w:r>
+              <w:rPr>
+                <w:rFonts w:ascii="Cambria" w:hAnsi="Cambria" w:cs="Andalus"/>
+                <w:b/>
+                <w:bCs/>
+                <w:sz w:val="24"/>
+                <w:szCs w:val="24"/>
+                <w:lang w:val="es-ES"/>
+              </w:rPr>
+              <w:t>{{</w:t>
+            </w:r>
+            <w:proofErr w:type="spellStart"/>
+            <w:r>
+              <w:rPr>
+                <w:rFonts w:ascii="Cambria" w:hAnsi="Cambria" w:cs="Andalus"/>
+                <w:b/>
+                <w:bCs/>
+                <w:sz w:val="24"/>
+                <w:szCs w:val="24"/>
+                <w:lang w:val="es-ES"/>
+              </w:rPr>
+              <w:t>Rep_numero</w:t>
+            </w:r>
+            <w:proofErr w:type="spellEnd"/>
+            <w:r>
+              <w:rPr>
+                <w:rFonts w:ascii="Cambria" w:hAnsi="Cambria" w:cs="Andalus"/>
+                <w:b/>
+                <w:bCs/>
+                <w:sz w:val="24"/>
+                <w:szCs w:val="24"/>
+                <w:lang w:val="es-ES"/>
+              </w:rPr>
+              <w:t>}}</w:t>
+            </w:r>
+          </w:p>
+          <w:p>
+            <w:pPr>
+              <w:spacing w:after="0" w:line="240" w:lineRule="auto"/>
+              <w:jc w:val="both"/>
+              <w:rPr>
+                <w:rFonts w:ascii="Cambria" w:eastAsia="Times New Roman" w:hAnsi="Cambria" w:cs="Arial"/>
+                <w:b/>
+                <w:bCs/>
+                <w:sz w:val="24"/>
+                <w:szCs w:val="24"/>
+                <w:lang w:eastAsia="es-PA"/>
+              </w:rPr>
+            </w:pPr>
+            <w:r>
+              <w:rPr>
+                <w:rFonts w:ascii="Cambria" w:hAnsi="Cambria" w:cs="Andalus"/>
+                <w:b/>
+                <w:bCs/>
+                <w:sz w:val="24"/>
+                <w:szCs w:val="24"/>
+                <w:lang w:val="es-ES"/>
+              </w:rPr>
+              <w:t>REPRESENTANTE LEGAL</w:t>
+            </w:r>
+          </w:p>
+        </w:tc>
+        <w:tc>
+          <w:tcPr>
+            <w:tcW w:w="4645" w:type="dxa"/>
+            <w:vMerge w:val="restart"/>
+            <w:tcBorders>
+              <w:top w:val="nil"/>
+              <w:left w:val="nil"/>
+              <w:bottom w:val="nil"/>
+              <w:right w:val="nil"/>
+            </w:tcBorders>
+            <w:vAlign w:val="center"/>
+          </w:tcPr>
+          <w:p>
+            <w:pPr>
+              <w:spacing w:after="0" w:line="240" w:lineRule="auto"/>
+              <w:jc w:val="center"/>
+              <w:rPr>
+                <w:rFonts w:ascii="Cambria" w:eastAsia="Times New Roman" w:hAnsi="Cambria" w:cs="Arial"/>
+                <w:sz w:val="24"/>
+                <w:szCs w:val="24"/>
+                <w:lang w:eastAsia="es-PA"/>
+              </w:rPr>
+            </w:pPr>
+            <w:r>
+              <w:rPr>
+                <w:rFonts w:ascii="Cambria" w:eastAsia="Times New Roman" w:hAnsi="Cambria" w:cs="Arial"/>
+                <w:noProof/>
+                <w:sz w:val="24"/>
+                <w:szCs w:val="24"/>
+                <w:lang w:eastAsia="es-PA"/>
+              </w:rPr>
+              <w:t>{{</w:t>
+            </w:r>
+            <w:r>
+              <w:rPr>
+                <w:rFonts w:ascii="Cambria" w:eastAsia="Times New Roman" w:hAnsi="Cambria" w:cs="Arial"/>
+                <w:noProof/>
+                <w:sz w:val="24"/>
+                <w:szCs w:val="24"/>
+                <w:lang w:eastAsia="es-PA"/>
+              </w:rPr>
+              <w:t>Foto</w:t>
+            </w:r>
+            <w:r>
+              <w:rPr>
+                <w:rFonts w:ascii="Cambria" w:eastAsia="Times New Roman" w:hAnsi="Cambria" w:cs="Arial"/>
+                <w:noProof/>
+                <w:sz w:val="24"/>
+                <w:szCs w:val="24"/>
+                <w:lang w:eastAsia="es-PA"/>
+              </w:rPr>
+              <w:t>}}</w:t>
+            </w:r>
+          </w:p>
+        </w:tc>
+      </w:tr>
+      <w:tr>
+        <w:tc>
+          <w:tcPr>
+            <w:tcW w:w="4931" w:type="dxa"/>
+            <w:tcBorders>
+              <w:top w:val="nil"/>
+              <w:left w:val="nil"/>
+              <w:bottom w:val="nil"/>
+              <w:right w:val="nil"/>
+            </w:tcBorders>
+          </w:tcPr>
+          <w:p>
+            <w:pPr>
+              <w:spacing w:after="0" w:line="240" w:lineRule="auto"/>
+              <w:jc w:val="both"/>
+              <w:rPr>
+                <w:rFonts w:ascii="Cambria" w:hAnsi="Cambria" w:cs="Andalus"/>
+                <w:sz w:val="24"/>
+                <w:szCs w:val="24"/>
+                <w:lang w:val="es-ES"/>
+              </w:rPr>
+            </w:pPr>
+          </w:p>
+          <w:p>
+            <w:pPr>
+              <w:spacing w:after="0" w:line="240" w:lineRule="auto"/>
+              <w:jc w:val="both"/>
+              <w:rPr>
+                <w:rFonts w:ascii="Cambria" w:hAnsi="Cambria" w:cs="Andalus"/>
+                <w:sz w:val="24"/>
+                <w:szCs w:val="24"/>
+                <w:lang w:val="es-ES"/>
+              </w:rPr>
+            </w:pPr>
+          </w:p>
+          <w:p>
+            <w:pPr>
+              <w:spacing w:after="0" w:line="240" w:lineRule="auto"/>
+              <w:jc w:val="both"/>
+              <w:rPr>
+                <w:rFonts w:ascii="Cambria" w:hAnsi="Cambria" w:cs="Andalus"/>
+                <w:sz w:val="24"/>
+                <w:szCs w:val="24"/>
+                <w:lang w:val="es-ES"/>
+              </w:rPr>
+            </w:pPr>
+          </w:p>
+          <w:p>
+            <w:pPr>
+              <w:spacing w:after="0" w:line="240" w:lineRule="auto"/>
+              <w:jc w:val="both"/>
+              <w:rPr>
+                <w:rFonts w:ascii="Cambria" w:hAnsi="Cambria" w:cs="Andalus"/>
+                <w:sz w:val="24"/>
+                <w:szCs w:val="24"/>
+                <w:lang w:val="es-ES"/>
+              </w:rPr>
+            </w:pPr>
+          </w:p>
+          <w:p>
+            <w:pPr>
+              <w:spacing w:after="0" w:line="240" w:lineRule="auto"/>
+              <w:jc w:val="both"/>
+              <w:rPr>
+                <w:rFonts w:ascii="Cambria" w:hAnsi="Cambria" w:cs="Andalus"/>
+                <w:sz w:val="24"/>
+                <w:szCs w:val="24"/>
+                <w:lang w:val="es-ES"/>
+              </w:rPr>
+            </w:pPr>
+            <w:r>
+              <w:rPr>
+                <w:rFonts w:ascii="Cambria" w:hAnsi="Cambria" w:cs="Andalus"/>
+                <w:sz w:val="24"/>
+                <w:szCs w:val="24"/>
+                <w:lang w:val="es-ES"/>
+              </w:rPr>
+              <w:t>{{Firma}}</w:t>
+            </w:r>
+          </w:p>
+          <w:p>
+            <w:pPr>
+              <w:spacing w:after="0" w:line="240" w:lineRule="auto"/>
+              <w:jc w:val="both"/>
+              <w:rPr>
+                <w:rFonts w:ascii="Cambria" w:eastAsia="Times New Roman" w:hAnsi="Cambria" w:cs="Arial"/>
+                <w:sz w:val="24"/>
+                <w:szCs w:val="24"/>
+                <w:lang w:eastAsia="es-PA"/>
+              </w:rPr>
+            </w:pPr>
+            <w:r>
+              <w:rPr>
+                <w:rFonts w:ascii="Cambria" w:eastAsia="Times New Roman" w:hAnsi="Cambria" w:cs="Arial"/>
+                <w:sz w:val="24"/>
+                <w:szCs w:val="24"/>
+                <w:lang w:eastAsia="es-PA"/>
+              </w:rPr>
+              <w:t>_____________________________________________________</w:t>
+            </w:r>
+          </w:p>
+          <w:p>
+            <w:pPr>
+              <w:spacing w:after="0" w:line="240" w:lineRule="auto"/>
+              <w:jc w:val="both"/>
+              <w:rPr>
+                <w:rFonts w:ascii="Cambria" w:hAnsi="Cambria"/>
+                <w:b/>
+                <w:bCs/>
+                <w:sz w:val="24"/>
+                <w:szCs w:val="24"/>
+                <w:lang w:val="es-MX"/>
+              </w:rPr>
+            </w:pPr>
+            <w:r>
+              <w:rPr>
+                <w:rFonts w:ascii="Cambria" w:hAnsi="Cambria"/>
+                <w:b/>
+                <w:bCs/>
+                <w:sz w:val="24"/>
+                <w:szCs w:val="24"/>
+                <w:lang w:val="es-MX"/>
+              </w:rPr>
+              <w:t>{{Nombre}}</w:t>
+            </w:r>
+          </w:p>
+          <w:p>
+            <w:pPr>
+              <w:spacing w:after="0" w:line="240" w:lineRule="auto"/>
+              <w:jc w:val="both"/>
+              <w:rPr>
+                <w:rFonts w:ascii="Cambria" w:hAnsi="Cambria" w:cs="Andalus"/>
+                <w:b/>
+                <w:bCs/>
+                <w:sz w:val="24"/>
+                <w:szCs w:val="24"/>
+                <w:lang w:val="es-ES"/>
+              </w:rPr>
+            </w:pPr>
+            <w:r>
+              <w:rPr>
+                <w:rFonts w:ascii="Cambria" w:eastAsia="Times New Roman" w:hAnsi="Cambria" w:cs="Arial"/>
+                <w:sz w:val="24"/>
+                <w:szCs w:val="24"/>
+                <w:lang w:val="es-ES" w:eastAsia="es-PA"/>
+              </w:rPr>
+              <w:t xml:space="preserve">CEDULA: </w:t>
+            </w:r>
+            <w:r>
+              <w:rPr>
+                <w:rFonts w:ascii="Cambria" w:hAnsi="Cambria" w:cs="Andalus"/>
+                <w:b/>
+                <w:bCs/>
+                <w:sz w:val="24"/>
+                <w:szCs w:val="24"/>
+                <w:lang w:val="es-ES"/>
+              </w:rPr>
+              <w:t>{{</w:t>
+            </w:r>
+            <w:r>
+              <w:rPr>
+                <w:rFonts w:ascii="Cambria" w:hAnsi="Cambria" w:cs="Andalus"/>
+                <w:b/>
+                <w:bCs/>
+                <w:sz w:val="24"/>
+                <w:szCs w:val="24"/>
+                <w:lang w:val="es-ES"/>
+              </w:rPr>
+              <w:t>Cedula</w:t>
+            </w:r>
+            <w:r>
+              <w:rPr>
+                <w:rFonts w:ascii="Cambria" w:hAnsi="Cambria" w:cs="Andalus"/>
+                <w:b/>
+                <w:bCs/>
+                <w:sz w:val="24"/>
+                <w:szCs w:val="24"/>
+                <w:lang w:val="es-ES"/>
+              </w:rPr>
+              <w:t>}}</w:t>
+            </w:r>
+          </w:p>
+          <w:p>
+            <w:pPr>
+              <w:spacing w:after="0" w:line="240" w:lineRule="auto"/>
+              <w:jc w:val="both"/>
+              <w:rPr>
+                <w:rFonts w:ascii="Cambria" w:eastAsia="Times New Roman" w:hAnsi="Cambria" w:cs="Arial"/>
+                <w:sz w:val="24"/>
+                <w:szCs w:val="24"/>
+                <w:lang w:eastAsia="es-PA"/>
+              </w:rPr>
+            </w:pPr>
+            <w:r>
+              <w:rPr>
+                <w:b/>
+              </w:rPr>
+              <w:t>ARRENDATARIO</w:t>
+            </w:r>
+          </w:p>
+        </w:tc>
+        <w:tc>
+          <w:tcPr>
+            <w:tcW w:w="4645" w:type="dxa"/>
+            <w:vMerge/>
+            <w:tcBorders>
+              <w:top w:val="nil"/>
+              <w:left w:val="nil"/>
+              <w:bottom w:val="nil"/>
+              <w:right w:val="nil"/>
+            </w:tcBorders>
+          </w:tcPr>
+          <w:p>
+            <w:pPr>
+              <w:spacing w:after="0" w:line="240" w:lineRule="auto"/>
+              <w:jc w:val="both"/>
+              <w:rPr>
+                <w:rFonts w:ascii="Cambria" w:eastAsia="Times New Roman" w:hAnsi="Cambria" w:cs="Arial"/>
+                <w:sz w:val="24"/>
+                <w:szCs w:val="24"/>
+                <w:lang w:eastAsia="es-PA"/>
+              </w:rPr>
+            </w:pPr>
+          </w:p>
+        </w:tc>
+      </w:tr>
+      <w:tr>
+        <w:trPr>
+          <w:trHeight w:val="1611"/>
+        </w:trPr>
+        <w:tc>
+          <w:tcPr>
+            <w:tcW w:w="9576" w:type="dxa"/>
+            <w:gridSpan w:val="2"/>
+            <w:tcBorders>
+              <w:top w:val="nil"/>
+              <w:left w:val="nil"/>
+              <w:bottom w:val="nil"/>
+              <w:right w:val="nil"/>
+            </w:tcBorders>
+            <w:vAlign w:val="bottom"/>
+          </w:tcPr>
+          <w:p>
+            <w:pPr>
+              <w:spacing w:after="0" w:line="240" w:lineRule="auto"/>
+              <w:jc w:val="center"/>
+              <w:rPr>
+                <w:rFonts w:ascii="Cambria" w:eastAsia="Times New Roman" w:hAnsi="Cambria" w:cs="Arial"/>
+                <w:sz w:val="24"/>
+                <w:szCs w:val="24"/>
+                <w:lang w:eastAsia="es-PA"/>
+              </w:rPr>
+            </w:pPr>
+            <w:r>
+              <w:rPr>
+                <w:rFonts w:ascii="Cambria" w:eastAsia="Times New Roman" w:hAnsi="Cambria" w:cs="Arial"/>
+                <w:sz w:val="24"/>
+                <w:szCs w:val="24"/>
+                <w:lang w:eastAsia="es-PA"/>
+              </w:rPr>
+              <w:t>{{</w:t>
+            </w:r>
+            <w:r>
+              <w:rPr>
+                <w:rFonts w:ascii="Cambria" w:eastAsia="Times New Roman" w:hAnsi="Cambria" w:cs="Arial"/>
+                <w:sz w:val="24"/>
+                <w:szCs w:val="24"/>
+                <w:lang w:eastAsia="es-PA"/>
+              </w:rPr>
+              <w:t>H</w:t>
+            </w:r>
+            <w:r>
+              <w:rPr>
+                <w:rFonts w:ascii="Cambria" w:eastAsia="Times New Roman" w:hAnsi="Cambria" w:cs="Arial"/>
+                <w:sz w:val="24"/>
+                <w:szCs w:val="24"/>
+                <w:lang w:eastAsia="es-PA"/>
+              </w:rPr>
+              <w:t>uella</w:t>
+            </w:r>
+            <w:r>
+              <w:rPr>
+                <w:rFonts w:ascii="Cambria" w:eastAsia="Times New Roman" w:hAnsi="Cambria" w:cs="Arial"/>
+                <w:sz w:val="24"/>
+                <w:szCs w:val="24"/>
+                <w:lang w:eastAsia="es-PA"/>
+              </w:rPr>
+              <w:t>}}</w:t>
+            </w:r>
+          </w:p>
+        </w:tc>
+      </w:tr>
+    </w:tbl>
     <w:p>
       <w:pPr>
         <w:spacing w:after="0" w:line="240" w:lineRule="auto"/>
-        <w:jc w:val="both"/>
-        <w:rPr>
-          <w:rFonts w:ascii="Cambria" w:eastAsia="Times New Roman" w:hAnsi="Cambria" w:cs="Arial"/>
-          <w:sz w:val="24"/>
-          <w:szCs w:val="24"/>
-          <w:lang w:eastAsia="es-PA"/>
+        <w:rPr>
+          <w:rFonts w:ascii="Cambria" w:hAnsi="Cambria" w:cs="Calibri Light"/>
+          <w:b/>
+          <w:sz w:val="20"/>
+          <w:szCs w:val="20"/>
+          <w:u w:val="single"/>
         </w:rPr>
       </w:pPr>
     </w:p>
     <w:p>
       <w:pPr>
         <w:spacing w:after="0" w:line="240" w:lineRule="auto"/>
-        <w:jc w:val="both"/>
-        <w:rPr>
-          <w:rFonts w:ascii="Cambria" w:eastAsia="Times New Roman" w:hAnsi="Cambria" w:cs="Arial"/>
-          <w:sz w:val="24"/>
-          <w:szCs w:val="24"/>
-          <w:lang w:eastAsia="es-PA"/>
-        </w:rPr>
-      </w:pPr>
-      <w:r>
-        <w:rPr>
-          <w:rFonts w:ascii="Cambria" w:eastAsia="Times New Roman" w:hAnsi="Cambria" w:cs="Arial"/>
-          <w:noProof/>
-          <w:sz w:val="24"/>
-          <w:szCs w:val="24"/>
-          <w:lang w:eastAsia="es-PA"/>
-        </w:rPr>
-        <w:t>{{Firma</w:t>
-      </w:r>
-      <w:r>
-        <w:rPr>
-          <w:rFonts w:ascii="Cambria" w:eastAsia="Times New Roman" w:hAnsi="Cambria" w:cs="Arial"/>
-          <w:noProof/>
-          <w:sz w:val="24"/>
-          <w:szCs w:val="24"/>
-          <w:lang w:eastAsia="es-PA"/>
-        </w:rPr>
-        <w:t>Representa</w:t>
-      </w:r>
-      <w:r>
-        <w:rPr>
-          <w:rFonts w:ascii="Cambria" w:eastAsia="Times New Roman" w:hAnsi="Cambria" w:cs="Arial"/>
-          <w:noProof/>
-          <w:sz w:val="24"/>
-          <w:szCs w:val="24"/>
-          <w:lang w:eastAsia="es-PA"/>
-        </w:rPr>
-        <w:t>}}</w:t>
-      </w:r>
-    </w:p>
-    <w:p>
-      <w:pPr>
-        <w:spacing w:after="0" w:line="240" w:lineRule="auto"/>
-        <w:jc w:val="both"/>
-        <w:rPr>
-          <w:rFonts w:ascii="Cambria" w:eastAsia="Times New Roman" w:hAnsi="Cambria" w:cs="Arial"/>
-          <w:sz w:val="24"/>
-          <w:szCs w:val="24"/>
-          <w:lang w:eastAsia="es-PA"/>
-        </w:rPr>
-      </w:pPr>
-      <w:r>
-        <w:rPr>
-          <w:rFonts w:ascii="Cambria" w:eastAsia="Times New Roman" w:hAnsi="Cambria" w:cs="Arial"/>
-          <w:sz w:val="24"/>
-          <w:szCs w:val="24"/>
-          <w:lang w:eastAsia="es-PA"/>
-        </w:rPr>
-        <w:t>______________________________________</w:t>
-      </w:r>
-      <w:r>
-        <w:rPr>
-          <w:rFonts w:ascii="Cambria" w:eastAsia="Times New Roman" w:hAnsi="Cambria" w:cs="Arial"/>
-          <w:sz w:val="24"/>
-          <w:szCs w:val="24"/>
-          <w:lang w:eastAsia="es-PA"/>
-        </w:rPr>
-        <w:tab/>
-      </w:r>
-      <w:r>
-        <w:rPr>
-          <w:rFonts w:ascii="Cambria" w:eastAsia="Times New Roman" w:hAnsi="Cambria" w:cs="Arial"/>
-          <w:sz w:val="24"/>
-          <w:szCs w:val="24"/>
-          <w:lang w:eastAsia="es-PA"/>
-        </w:rPr>
-        <w:tab/>
-      </w:r>
-      <w:r>
-        <w:rPr>
-          <w:rFonts w:ascii="Cambria" w:eastAsia="Times New Roman" w:hAnsi="Cambria" w:cs="Arial"/>
-          <w:sz w:val="24"/>
-          <w:szCs w:val="24"/>
-          <w:lang w:eastAsia="es-PA"/>
-        </w:rPr>
-        <w:tab/>
-      </w:r>
-      <w:r>
-        <w:rPr>
-          <w:rFonts w:ascii="Cambria" w:eastAsia="Times New Roman" w:hAnsi="Cambria" w:cs="Arial"/>
-          <w:sz w:val="24"/>
-          <w:szCs w:val="24"/>
-          <w:lang w:eastAsia="es-PA"/>
-        </w:rPr>
-        <w:tab/>
-      </w:r>
-      <w:r>
-        <w:rPr>
-          <w:rFonts w:ascii="Cambria" w:eastAsia="Times New Roman" w:hAnsi="Cambria" w:cs="Arial"/>
-          <w:sz w:val="24"/>
-          <w:szCs w:val="24"/>
-          <w:lang w:eastAsia="es-PA"/>
-        </w:rPr>
-        <w:tab/>
-      </w:r>
-    </w:p>
-    <w:p>
-      <w:pPr>
-        <w:spacing w:after="0" w:line="240" w:lineRule="auto"/>
-        <w:jc w:val="both"/>
-        <w:rPr>
-          <w:rFonts w:ascii="Cambria" w:eastAsia="Times New Roman" w:hAnsi="Cambria" w:cs="Arial"/>
-          <w:sz w:val="24"/>
-          <w:szCs w:val="24"/>
-          <w:lang w:eastAsia="es-PA"/>
-        </w:rPr>
-      </w:pPr>
-      <w:r>
-        <w:rPr>
-          <w:rFonts w:ascii="Cambria" w:hAnsi="Cambria"/>
-          <w:b/>
-          <w:bCs/>
-          <w:sz w:val="24"/>
-          <w:szCs w:val="24"/>
-          <w:lang w:val="es-MX"/>
-        </w:rPr>
-        <w:t>{{</w:t>
-      </w:r>
-      <w:r>
-        <w:rPr>
-          <w:rFonts w:ascii="Cambria" w:hAnsi="Cambria"/>
-          <w:b/>
-          <w:bCs/>
-          <w:sz w:val="24"/>
-          <w:szCs w:val="24"/>
-          <w:lang w:val="es-MX"/>
-        </w:rPr>
-        <w:t>Representa</w:t>
-      </w:r>
-      <w:r>
-        <w:rPr>
-          <w:rFonts w:ascii="Cambria" w:hAnsi="Cambria"/>
-          <w:b/>
-          <w:bCs/>
-          <w:sz w:val="24"/>
-          <w:szCs w:val="24"/>
-          <w:lang w:val="es-MX"/>
-        </w:rPr>
-        <w:t>}}</w:t>
-      </w:r>
-    </w:p>
-    <w:p>
-      <w:pPr>
-        <w:spacing w:after="0" w:line="240" w:lineRule="auto"/>
-        <w:jc w:val="both"/>
-        <w:rPr>
-          <w:rFonts w:ascii="Cambria" w:hAnsi="Cambria" w:cs="Andalus"/>
-          <w:b/>
-          <w:bCs/>
-          <w:sz w:val="24"/>
-          <w:szCs w:val="24"/>
-          <w:lang w:val="es-ES"/>
-        </w:rPr>
-      </w:pPr>
-      <w:r>
-        <w:rPr>
-          <w:rFonts w:ascii="Cambria" w:eastAsia="Times New Roman" w:hAnsi="Cambria" w:cs="Arial"/>
-          <w:sz w:val="24"/>
-          <w:szCs w:val="24"/>
-          <w:lang w:val="es-ES" w:eastAsia="es-PA"/>
-        </w:rPr>
-        <w:t xml:space="preserve">CEDULA: </w:t>
-      </w:r>
-      <w:r>
-        <w:rPr>
-          <w:rFonts w:ascii="Cambria" w:hAnsi="Cambria" w:cs="Andalus"/>
-          <w:b/>
-          <w:bCs/>
-          <w:sz w:val="24"/>
-          <w:szCs w:val="24"/>
-          <w:lang w:val="es-ES"/>
-        </w:rPr>
-        <w:t>{{</w:t>
-      </w:r>
-      <w:proofErr w:type="spellStart"/>
-      <w:r>
-        <w:rPr>
-          <w:rFonts w:ascii="Cambria" w:hAnsi="Cambria" w:cs="Andalus"/>
-          <w:b/>
-          <w:bCs/>
-          <w:sz w:val="24"/>
-          <w:szCs w:val="24"/>
-          <w:lang w:val="es-ES"/>
-        </w:rPr>
-        <w:t>Rep_numero</w:t>
-      </w:r>
-      <w:proofErr w:type="spellEnd"/>
-      <w:r>
-        <w:rPr>
-          <w:rFonts w:ascii="Cambria" w:hAnsi="Cambria" w:cs="Andalus"/>
-          <w:b/>
-          <w:bCs/>
-          <w:sz w:val="24"/>
-          <w:szCs w:val="24"/>
-          <w:lang w:val="es-ES"/>
-        </w:rPr>
-        <w:t>}}</w:t>
-      </w:r>
-    </w:p>
-    <w:p>
-      <w:pPr>
-        <w:spacing w:after="0" w:line="240" w:lineRule="auto"/>
-        <w:jc w:val="both"/>
-        <w:rPr>
-          <w:rFonts w:ascii="Cambria" w:hAnsi="Cambria" w:cs="Andalus"/>
-          <w:b/>
-          <w:bCs/>
-          <w:sz w:val="24"/>
-          <w:szCs w:val="24"/>
-          <w:lang w:val="es-ES"/>
-        </w:rPr>
-      </w:pPr>
-      <w:r>
-        <w:rPr>
-          <w:rFonts w:ascii="Cambria" w:hAnsi="Cambria" w:cs="Andalus"/>
-          <w:b/>
-          <w:bCs/>
-          <w:sz w:val="24"/>
-          <w:szCs w:val="24"/>
-          <w:lang w:val="es-ES"/>
-        </w:rPr>
-        <w:t>REPRESENTANTE LEGAL</w:t>
-      </w:r>
-    </w:p>
-    <w:p>
-      <w:pPr>
-        <w:spacing w:after="0" w:line="240" w:lineRule="auto"/>
-        <w:jc w:val="both"/>
-        <w:rPr>
-          <w:rFonts w:ascii="Cambria" w:hAnsi="Cambria" w:cs="Andalus"/>
-          <w:b/>
-          <w:bCs/>
-          <w:sz w:val="24"/>
-          <w:szCs w:val="24"/>
-          <w:lang w:val="es-ES"/>
-        </w:rPr>
-      </w:pPr>
-    </w:p>
-    <w:p>
-      <w:pPr>
-        <w:spacing w:after="0" w:line="240" w:lineRule="auto"/>
-        <w:jc w:val="both"/>
-        <w:rPr>
-          <w:rFonts w:ascii="Cambria" w:hAnsi="Cambria" w:cs="Andalus"/>
-          <w:b/>
-          <w:bCs/>
-          <w:sz w:val="24"/>
-          <w:szCs w:val="24"/>
-          <w:lang w:val="es-ES"/>
-        </w:rPr>
-      </w:pPr>
-      <w:r>
-        <w:rPr>
-          <w:rFonts w:ascii="Cambria" w:hAnsi="Cambria" w:cs="Andalus"/>
-          <w:b/>
-          <w:bCs/>
-          <w:sz w:val="24"/>
-          <w:szCs w:val="24"/>
-          <w:lang w:val="es-ES"/>
-        </w:rPr>
-        <w:tab/>
-      </w:r>
-      <w:r>
-        <w:rPr>
-          <w:rFonts w:ascii="Cambria" w:hAnsi="Cambria" w:cs="Andalus"/>
-          <w:b/>
-          <w:bCs/>
-          <w:sz w:val="24"/>
-          <w:szCs w:val="24"/>
-          <w:lang w:val="es-ES"/>
-        </w:rPr>
-        <w:tab/>
-      </w:r>
-      <w:r>
-        <w:rPr>
-          <w:rFonts w:ascii="Cambria" w:hAnsi="Cambria" w:cs="Andalus"/>
-          <w:b/>
-          <w:bCs/>
-          <w:sz w:val="24"/>
-          <w:szCs w:val="24"/>
-          <w:lang w:val="es-ES"/>
-        </w:rPr>
-        <w:tab/>
-      </w:r>
-      <w:r>
-        <w:rPr>
-          <w:rFonts w:ascii="Cambria" w:hAnsi="Cambria" w:cs="Andalus"/>
-          <w:b/>
-          <w:bCs/>
-          <w:sz w:val="24"/>
-          <w:szCs w:val="24"/>
-          <w:lang w:val="es-ES"/>
-        </w:rPr>
-        <w:tab/>
-      </w:r>
-      <w:r>
-        <w:rPr>
-          <w:rFonts w:ascii="Cambria" w:hAnsi="Cambria" w:cs="Andalus"/>
-          <w:b/>
-          <w:bCs/>
-          <w:sz w:val="24"/>
-          <w:szCs w:val="24"/>
-          <w:lang w:val="es-ES"/>
-        </w:rPr>
-        <w:tab/>
-      </w:r>
-      <w:r>
-        <w:rPr>
-          <w:rFonts w:ascii="Cambria" w:hAnsi="Cambria" w:cs="Andalus"/>
-          <w:b/>
-          <w:bCs/>
-          <w:sz w:val="24"/>
-          <w:szCs w:val="24"/>
-          <w:lang w:val="es-ES"/>
-        </w:rPr>
-        <w:tab/>
-      </w:r>
-      <w:r>
-        <w:rPr>
-          <w:rFonts w:ascii="Cambria" w:hAnsi="Cambria" w:cs="Andalus"/>
-          <w:b/>
-          <w:bCs/>
-          <w:sz w:val="24"/>
-          <w:szCs w:val="24"/>
-          <w:lang w:val="es-ES"/>
-        </w:rPr>
-        <w:tab/>
-      </w:r>
-    </w:p>
-    <w:p>
-      <w:pPr>
-        <w:spacing w:after="0" w:line="240" w:lineRule="auto"/>
-        <w:jc w:val="both"/>
-        <w:rPr>
-          <w:rFonts w:ascii="Cambria" w:hAnsi="Cambria" w:cs="Andalus"/>
-          <w:b/>
-          <w:bCs/>
-          <w:sz w:val="24"/>
-          <w:szCs w:val="24"/>
-          <w:lang w:val="es-ES"/>
-        </w:rPr>
-      </w:pPr>
-    </w:p>
-    <w:p>
-      <w:pPr>
-        <w:spacing w:after="0" w:line="240" w:lineRule="auto"/>
-        <w:jc w:val="both"/>
-        <w:rPr>
-          <w:rFonts w:ascii="Cambria" w:hAnsi="Cambria" w:cs="Andalus"/>
-          <w:b/>
-          <w:bCs/>
-          <w:sz w:val="24"/>
-          <w:szCs w:val="24"/>
-          <w:lang w:val="es-ES"/>
-        </w:rPr>
-      </w:pPr>
-    </w:p>
-    <w:p>
-      <w:pPr>
-        <w:spacing w:after="0" w:line="240" w:lineRule="auto"/>
-        <w:jc w:val="both"/>
-        <w:rPr>
-          <w:rFonts w:ascii="Cambria" w:hAnsi="Cambria" w:cs="Andalus"/>
-          <w:b/>
-          <w:bCs/>
-          <w:sz w:val="24"/>
-          <w:szCs w:val="24"/>
-          <w:lang w:val="es-ES"/>
-        </w:rPr>
-      </w:pPr>
-    </w:p>
-    <w:p>
-      <w:pPr>
-        <w:spacing w:after="0" w:line="240" w:lineRule="auto"/>
-        <w:jc w:val="both"/>
-        <w:rPr>
-          <w:rFonts w:ascii="Cambria" w:hAnsi="Cambria" w:cs="Andalus"/>
-          <w:sz w:val="24"/>
-          <w:szCs w:val="24"/>
-          <w:lang w:val="es-ES"/>
-        </w:rPr>
-      </w:pPr>
-      <w:r>
-        <w:rPr>
-          <w:rFonts w:ascii="Cambria" w:hAnsi="Cambria" w:cs="Andalus"/>
-          <w:sz w:val="24"/>
-          <w:szCs w:val="24"/>
-          <w:lang w:val="es-ES"/>
-        </w:rPr>
-        <w:t>{{Firma}}</w:t>
-      </w:r>
-    </w:p>
-    <w:p>
-      <w:pPr>
-        <w:spacing w:after="0" w:line="240" w:lineRule="auto"/>
-        <w:jc w:val="both"/>
-        <w:rPr>
-          <w:rFonts w:ascii="Cambria" w:eastAsia="Times New Roman" w:hAnsi="Cambria" w:cs="Arial"/>
-          <w:sz w:val="24"/>
-          <w:szCs w:val="24"/>
-          <w:lang w:eastAsia="es-PA"/>
-        </w:rPr>
-      </w:pPr>
-      <w:r>
-        <w:rPr>
-          <w:rFonts w:ascii="Cambria" w:eastAsia="Times New Roman" w:hAnsi="Cambria" w:cs="Arial"/>
-          <w:sz w:val="24"/>
-          <w:szCs w:val="24"/>
-          <w:lang w:eastAsia="es-PA"/>
-        </w:rPr>
-        <w:t>______________________________________</w:t>
-      </w:r>
-    </w:p>
-    <w:p>
-      <w:pPr>
-        <w:spacing w:after="0" w:line="240" w:lineRule="auto"/>
-        <w:jc w:val="both"/>
-        <w:rPr>
-          <w:rFonts w:ascii="Cambria" w:eastAsia="Times New Roman" w:hAnsi="Cambria" w:cs="Arial"/>
-          <w:sz w:val="24"/>
-          <w:szCs w:val="24"/>
-          <w:lang w:val="es-ES" w:eastAsia="es-PA"/>
-        </w:rPr>
-      </w:pPr>
-      <w:r>
-        <w:rPr>
-          <w:rFonts w:ascii="Cambria" w:hAnsi="Cambria"/>
-          <w:b/>
-          <w:bCs/>
-          <w:sz w:val="24"/>
-          <w:szCs w:val="24"/>
-          <w:lang w:val="es-MX"/>
-        </w:rPr>
-        <w:t>{{</w:t>
-      </w:r>
-      <w:r>
-        <w:rPr>
-          <w:rFonts w:ascii="Cambria" w:hAnsi="Cambria"/>
-          <w:b/>
-          <w:bCs/>
-          <w:sz w:val="24"/>
-          <w:szCs w:val="24"/>
-          <w:lang w:val="es-MX"/>
-        </w:rPr>
-        <w:t>Nombre</w:t>
-      </w:r>
-      <w:r>
-        <w:rPr>
-          <w:rFonts w:ascii="Cambria" w:hAnsi="Cambria"/>
-          <w:b/>
-          <w:bCs/>
-          <w:sz w:val="24"/>
-          <w:szCs w:val="24"/>
-          <w:lang w:val="es-MX"/>
-        </w:rPr>
-        <w:t>}}</w:t>
-      </w:r>
-    </w:p>
-    <w:p>
-      <w:pPr>
-        <w:spacing w:after="0" w:line="240" w:lineRule="auto"/>
-        <w:jc w:val="both"/>
-        <w:rPr>
-          <w:rFonts w:ascii="Cambria" w:hAnsi="Cambria" w:cs="Andalus"/>
-          <w:b/>
-          <w:bCs/>
-          <w:sz w:val="24"/>
-          <w:szCs w:val="24"/>
-          <w:lang w:val="es-ES"/>
-        </w:rPr>
-      </w:pPr>
-      <w:r>
-        <w:rPr>
-          <w:rFonts w:ascii="Cambria" w:eastAsia="Times New Roman" w:hAnsi="Cambria" w:cs="Arial"/>
-          <w:sz w:val="24"/>
-          <w:szCs w:val="24"/>
-          <w:lang w:val="es-ES" w:eastAsia="es-PA"/>
-        </w:rPr>
-        <w:t xml:space="preserve">CEDULA: </w:t>
-      </w:r>
-      <w:r>
-        <w:rPr>
-          <w:rFonts w:ascii="Cambria" w:hAnsi="Cambria" w:cs="Andalus"/>
-          <w:b/>
-          <w:bCs/>
-          <w:sz w:val="24"/>
-          <w:szCs w:val="24"/>
-          <w:lang w:val="es-ES"/>
-        </w:rPr>
-        <w:t>{{</w:t>
-      </w:r>
-      <w:r>
-        <w:rPr>
-          <w:rFonts w:ascii="Cambria" w:hAnsi="Cambria" w:cs="Andalus"/>
-          <w:b/>
-          <w:bCs/>
-          <w:sz w:val="24"/>
-          <w:szCs w:val="24"/>
-          <w:lang w:val="es-ES"/>
-        </w:rPr>
-        <w:t>Cedula</w:t>
-      </w:r>
-      <w:r>
-        <w:rPr>
-          <w:rFonts w:ascii="Cambria" w:hAnsi="Cambria" w:cs="Andalus"/>
-          <w:b/>
-          <w:bCs/>
-          <w:sz w:val="24"/>
-          <w:szCs w:val="24"/>
-          <w:lang w:val="es-ES"/>
-        </w:rPr>
-        <w:t>}}</w:t>
-      </w:r>
-    </w:p>
-    <w:p>
-      <w:pPr>
-        <w:spacing w:after="0"/>
-      </w:pPr>
-      <w:r>
-        <w:rPr>
-          <w:b/>
-        </w:rPr>
-        <w:t>ARRENDATARIO</w:t>
-      </w:r>
-    </w:p>
-    <w:p>
-      <w:pPr>
-        <w:spacing w:after="0" w:line="240" w:lineRule="auto"/>
-        <w:rPr>
-          <w:rFonts w:ascii="Cambria" w:hAnsi="Cambria" w:cs="Andalus"/>
-          <w:b/>
-          <w:bCs/>
-          <w:sz w:val="24"/>
-          <w:szCs w:val="24"/>
-          <w:lang w:val="es-ES"/>
-        </w:rPr>
-      </w:pPr>
-    </w:p>
-    <w:p>
-      <w:pPr>
-        <w:spacing w:after="0" w:line="240" w:lineRule="auto"/>
-        <w:jc w:val="both"/>
-        <w:rPr>
-          <w:rFonts w:ascii="Cambria" w:eastAsia="Times New Roman" w:hAnsi="Cambria" w:cs="Arial"/>
-          <w:sz w:val="24"/>
-          <w:szCs w:val="24"/>
-          <w:lang w:val="es-ES" w:eastAsia="es-PA"/>
-        </w:rPr>
-      </w:pPr>
-    </w:p>
-    <w:p>
-      <w:pPr>
-        <w:spacing w:after="0" w:line="240" w:lineRule="auto"/>
-        <w:jc w:val="both"/>
-        <w:rPr>
-          <w:rFonts w:ascii="Cambria" w:eastAsia="Times New Roman" w:hAnsi="Cambria" w:cs="Arial"/>
-          <w:sz w:val="24"/>
-          <w:szCs w:val="24"/>
-          <w:lang w:val="es-ES" w:eastAsia="es-PA"/>
-        </w:rPr>
-      </w:pPr>
-    </w:p>
-    <w:p>
-      <w:pPr>
-        <w:spacing w:after="0" w:line="240" w:lineRule="auto"/>
-        <w:jc w:val="both"/>
-        <w:rPr>
-          <w:rFonts w:ascii="Cambria" w:eastAsia="Times New Roman" w:hAnsi="Cambria" w:cs="Arial"/>
-          <w:sz w:val="24"/>
-          <w:szCs w:val="24"/>
-          <w:lang w:val="es-ES" w:eastAsia="es-PA"/>
-        </w:rPr>
-      </w:pPr>
-    </w:p>
-    <w:p>
-      <w:pPr>
-        <w:spacing w:after="0" w:line="240" w:lineRule="auto"/>
-        <w:jc w:val="both"/>
-        <w:rPr>
-          <w:rFonts w:ascii="Cambria" w:eastAsia="Times New Roman" w:hAnsi="Cambria" w:cs="Arial"/>
-          <w:sz w:val="24"/>
-          <w:szCs w:val="24"/>
-          <w:lang w:val="es-ES" w:eastAsia="es-PA"/>
-        </w:rPr>
-      </w:pPr>
-    </w:p>
-    <w:p>
-      <w:pPr>
-        <w:spacing w:after="0" w:line="240" w:lineRule="auto"/>
-        <w:jc w:val="both"/>
-        <w:rPr>
-          <w:rFonts w:ascii="Cambria" w:eastAsia="Times New Roman" w:hAnsi="Cambria" w:cs="Arial"/>
-          <w:sz w:val="24"/>
-          <w:szCs w:val="24"/>
-          <w:lang w:val="es-ES" w:eastAsia="es-PA"/>
-        </w:rPr>
-      </w:pPr>
-    </w:p>
-    <w:p>
-      <w:pPr>
-        <w:spacing w:after="0" w:line="240" w:lineRule="auto"/>
-        <w:jc w:val="both"/>
-        <w:rPr>
-          <w:rFonts w:ascii="Cambria" w:eastAsia="Times New Roman" w:hAnsi="Cambria" w:cs="Arial"/>
-          <w:sz w:val="24"/>
-          <w:szCs w:val="24"/>
-          <w:lang w:val="es-ES" w:eastAsia="es-PA"/>
-        </w:rPr>
-      </w:pPr>
-    </w:p>
-    <w:p>
-      <w:pPr>
-        <w:spacing w:after="0" w:line="240" w:lineRule="auto"/>
-        <w:jc w:val="both"/>
-        <w:rPr>
-          <w:rFonts w:ascii="Cambria" w:eastAsia="Times New Roman" w:hAnsi="Cambria" w:cs="Arial"/>
-          <w:sz w:val="24"/>
-          <w:szCs w:val="24"/>
-          <w:lang w:val="es-ES" w:eastAsia="es-PA"/>
-        </w:rPr>
-      </w:pPr>
+        <w:rPr>
+          <w:rFonts w:ascii="Cambria" w:hAnsi="Cambria" w:cs="Calibri Light"/>
+          <w:b/>
+          <w:sz w:val="20"/>
+          <w:szCs w:val="20"/>
+          <w:u w:val="single"/>
+        </w:rPr>
+      </w:pPr>
+      <w:r>
+        <w:rPr>
+          <w:rFonts w:ascii="Cambria" w:hAnsi="Cambria" w:cs="Calibri Light"/>
+          <w:b/>
+          <w:sz w:val="20"/>
+          <w:szCs w:val="20"/>
+          <w:u w:val="single"/>
+        </w:rPr>
+        <w:br w:type="page"/>
+      </w:r>
     </w:p>
     <w:p>
       <w:pPr>
@@ -5138,16 +5152,6 @@
           <w:szCs w:val="20"/>
           <w:u w:val="single"/>
         </w:rPr>
-        <w:br w:type="column"/>
-      </w:r>
-      <w:r>
-        <w:rPr>
-          <w:rFonts w:ascii="Cambria" w:hAnsi="Cambria" w:cs="Calibri Light"/>
-          <w:b/>
-          <w:sz w:val="20"/>
-          <w:szCs w:val="20"/>
-          <w:u w:val="single"/>
-        </w:rPr>
         <w:lastRenderedPageBreak/>
         <w:t xml:space="preserve">UNIDAD N° </w:t>
       </w:r>
@@ -5160,7 +5164,29 @@
           <w:u w:val="single"/>
           <w:lang w:val="es-CO"/>
         </w:rPr>
-        <w:t>{{Unidad}}</w:t>
+        <w:t>{{</w:t>
+      </w:r>
+      <w:r>
+        <w:rPr>
+          <w:rFonts w:ascii="Cambria" w:hAnsi="Cambria" w:cs="Calibri Light"/>
+          <w:b/>
+          <w:sz w:val="20"/>
+          <w:szCs w:val="20"/>
+          <w:u w:val="single"/>
+          <w:lang w:val="es-CO"/>
+        </w:rPr>
+        <w:t>Unidad</w:t>
+      </w:r>
+      <w:r>
+        <w:rPr>
+          <w:rFonts w:ascii="Cambria" w:hAnsi="Cambria" w:cs="Calibri Light"/>
+          <w:b/>
+          <w:sz w:val="20"/>
+          <w:szCs w:val="20"/>
+          <w:u w:val="single"/>
+          <w:lang w:val="es-CO"/>
+        </w:rPr>
+        <w:t>}}</w:t>
       </w:r>
       <w:r>
         <w:rPr>
@@ -5198,29 +5224,7 @@
           <w:szCs w:val="20"/>
           <w:u w:val="single"/>
         </w:rPr>
-        <w:t xml:space="preserve">Operador </w:t>
-      </w:r>
-      <w:proofErr w:type="spellStart"/>
-      <w:r>
-        <w:rPr>
-          <w:rFonts w:ascii="Cambria" w:hAnsi="Cambria" w:cs="Calibri Light"/>
-          <w:b/>
-          <w:sz w:val="20"/>
-          <w:szCs w:val="20"/>
-          <w:u w:val="single"/>
-        </w:rPr>
-        <w:t>N°</w:t>
-      </w:r>
-      <w:proofErr w:type="spellEnd"/>
-      <w:r>
-        <w:rPr>
-          <w:rFonts w:ascii="Cambria" w:hAnsi="Cambria" w:cs="Calibri Light"/>
-          <w:b/>
-          <w:sz w:val="20"/>
-          <w:szCs w:val="20"/>
-          <w:u w:val="single"/>
-        </w:rPr>
-        <w:t xml:space="preserve"> </w:t>
+        <w:t xml:space="preserve">Operador N° </w:t>
       </w:r>
       <w:r>
         <w:rPr>
@@ -5594,13 +5598,181 @@
         <w:rPr>
           <w:rFonts w:ascii="Cambria" w:hAnsi="Cambria" w:cs="Calibri Light"/>
         </w:rPr>
-        <w:t xml:space="preserve"> este medio me comprometo de manera irrevocable, bajo la gravedad de juramento mediante la presente declaracion jurada a no ceder el manejo de la </w:t>
+        <w:t xml:space="preserve"> este medio me </w:t>
       </w:r>
       <w:proofErr w:type="spellStart"/>
       <w:r>
         <w:rPr>
           <w:rFonts w:ascii="Cambria" w:hAnsi="Cambria" w:cs="Calibri Light"/>
         </w:rPr>
+        <w:t>comprometo</w:t>
+      </w:r>
+      <w:proofErr w:type="spellEnd"/>
+      <w:r>
+        <w:rPr>
+          <w:rFonts w:ascii="Cambria" w:hAnsi="Cambria" w:cs="Calibri Light"/>
+        </w:rPr>
+        <w:t xml:space="preserve"> de </w:t>
+      </w:r>
+      <w:proofErr w:type="spellStart"/>
+      <w:r>
+        <w:rPr>
+          <w:rFonts w:ascii="Cambria" w:hAnsi="Cambria" w:cs="Calibri Light"/>
+        </w:rPr>
+        <w:t>manera</w:t>
+      </w:r>
+      <w:proofErr w:type="spellEnd"/>
+      <w:r>
+        <w:rPr>
+          <w:rFonts w:ascii="Cambria" w:hAnsi="Cambria" w:cs="Calibri Light"/>
+        </w:rPr>
+        <w:t xml:space="preserve"> </w:t>
+      </w:r>
+      <w:proofErr w:type="spellStart"/>
+      <w:r>
+        <w:rPr>
+          <w:rFonts w:ascii="Cambria" w:hAnsi="Cambria" w:cs="Calibri Light"/>
+        </w:rPr>
+        <w:t>irrevocable</w:t>
+      </w:r>
+      <w:proofErr w:type="spellEnd"/>
+      <w:r>
+        <w:rPr>
+          <w:rFonts w:ascii="Cambria" w:hAnsi="Cambria" w:cs="Calibri Light"/>
+        </w:rPr>
+        <w:t xml:space="preserve">, </w:t>
+      </w:r>
+      <w:proofErr w:type="spellStart"/>
+      <w:r>
+        <w:rPr>
+          <w:rFonts w:ascii="Cambria" w:hAnsi="Cambria" w:cs="Calibri Light"/>
+        </w:rPr>
+        <w:t>bajo</w:t>
+      </w:r>
+      <w:proofErr w:type="spellEnd"/>
+      <w:r>
+        <w:rPr>
+          <w:rFonts w:ascii="Cambria" w:hAnsi="Cambria" w:cs="Calibri Light"/>
+        </w:rPr>
+        <w:t xml:space="preserve"> la </w:t>
+      </w:r>
+      <w:proofErr w:type="spellStart"/>
+      <w:r>
+        <w:rPr>
+          <w:rFonts w:ascii="Cambria" w:hAnsi="Cambria" w:cs="Calibri Light"/>
+        </w:rPr>
+        <w:t>gravedad</w:t>
+      </w:r>
+      <w:proofErr w:type="spellEnd"/>
+      <w:r>
+        <w:rPr>
+          <w:rFonts w:ascii="Cambria" w:hAnsi="Cambria" w:cs="Calibri Light"/>
+        </w:rPr>
+        <w:t xml:space="preserve"> de </w:t>
+      </w:r>
+      <w:proofErr w:type="spellStart"/>
+      <w:r>
+        <w:rPr>
+          <w:rFonts w:ascii="Cambria" w:hAnsi="Cambria" w:cs="Calibri Light"/>
+        </w:rPr>
+        <w:t>juramento</w:t>
+      </w:r>
+      <w:proofErr w:type="spellEnd"/>
+      <w:r>
+        <w:rPr>
+          <w:rFonts w:ascii="Cambria" w:hAnsi="Cambria" w:cs="Calibri Light"/>
+        </w:rPr>
+        <w:t xml:space="preserve"> </w:t>
+      </w:r>
+      <w:proofErr w:type="spellStart"/>
+      <w:r>
+        <w:rPr>
+          <w:rFonts w:ascii="Cambria" w:hAnsi="Cambria" w:cs="Calibri Light"/>
+        </w:rPr>
+        <w:t>mediante</w:t>
+      </w:r>
+      <w:proofErr w:type="spellEnd"/>
+      <w:r>
+        <w:rPr>
+          <w:rFonts w:ascii="Cambria" w:hAnsi="Cambria" w:cs="Calibri Light"/>
+        </w:rPr>
+        <w:t xml:space="preserve"> la </w:t>
+      </w:r>
+      <w:proofErr w:type="spellStart"/>
+      <w:r>
+        <w:rPr>
+          <w:rFonts w:ascii="Cambria" w:hAnsi="Cambria" w:cs="Calibri Light"/>
+        </w:rPr>
+        <w:t>presente</w:t>
+      </w:r>
+      <w:proofErr w:type="spellEnd"/>
+      <w:r>
+        <w:rPr>
+          <w:rFonts w:ascii="Cambria" w:hAnsi="Cambria" w:cs="Calibri Light"/>
+        </w:rPr>
+        <w:t xml:space="preserve"> </w:t>
+      </w:r>
+      <w:proofErr w:type="spellStart"/>
+      <w:r>
+        <w:rPr>
+          <w:rFonts w:ascii="Cambria" w:hAnsi="Cambria" w:cs="Calibri Light"/>
+        </w:rPr>
+        <w:t>declaracion</w:t>
+      </w:r>
+      <w:proofErr w:type="spellEnd"/>
+      <w:r>
+        <w:rPr>
+          <w:rFonts w:ascii="Cambria" w:hAnsi="Cambria" w:cs="Calibri Light"/>
+        </w:rPr>
+        <w:t xml:space="preserve"> </w:t>
+      </w:r>
+      <w:proofErr w:type="spellStart"/>
+      <w:r>
+        <w:rPr>
+          <w:rFonts w:ascii="Cambria" w:hAnsi="Cambria" w:cs="Calibri Light"/>
+        </w:rPr>
+        <w:t>jurada</w:t>
+      </w:r>
+      <w:proofErr w:type="spellEnd"/>
+      <w:r>
+        <w:rPr>
+          <w:rFonts w:ascii="Cambria" w:hAnsi="Cambria" w:cs="Calibri Light"/>
+        </w:rPr>
+        <w:t xml:space="preserve"> a no </w:t>
+      </w:r>
+      <w:proofErr w:type="spellStart"/>
+      <w:r>
+        <w:rPr>
+          <w:rFonts w:ascii="Cambria" w:hAnsi="Cambria" w:cs="Calibri Light"/>
+        </w:rPr>
+        <w:t>ceder</w:t>
+      </w:r>
+      <w:proofErr w:type="spellEnd"/>
+      <w:r>
+        <w:rPr>
+          <w:rFonts w:ascii="Cambria" w:hAnsi="Cambria" w:cs="Calibri Light"/>
+        </w:rPr>
+        <w:t xml:space="preserve"> el </w:t>
+      </w:r>
+      <w:proofErr w:type="spellStart"/>
+      <w:r>
+        <w:rPr>
+          <w:rFonts w:ascii="Cambria" w:hAnsi="Cambria" w:cs="Calibri Light"/>
+        </w:rPr>
+        <w:t>manejo</w:t>
+      </w:r>
+      <w:proofErr w:type="spellEnd"/>
+      <w:r>
+        <w:rPr>
+          <w:rFonts w:ascii="Cambria" w:hAnsi="Cambria" w:cs="Calibri Light"/>
+        </w:rPr>
+        <w:t xml:space="preserve"> de la </w:t>
+      </w:r>
+      <w:proofErr w:type="spellStart"/>
+      <w:r>
+        <w:rPr>
+          <w:rFonts w:ascii="Cambria" w:hAnsi="Cambria" w:cs="Calibri Light"/>
+        </w:rPr>
         <w:t>unidad</w:t>
       </w:r>
       <w:proofErr w:type="spellEnd"/>
@@ -5669,6 +5841,7 @@
         </w:rPr>
         <w:t>{{</w:t>
       </w:r>
+      <w:proofErr w:type="spellStart"/>
       <w:r>
         <w:rPr>
           <w:rStyle w:val="StrongEmphasis"/>
@@ -5676,6 +5849,7 @@
         </w:rPr>
         <w:t>Placa</w:t>
       </w:r>
+      <w:proofErr w:type="spellEnd"/>
       <w:r>
         <w:rPr>
           <w:rStyle w:val="StrongEmphasis"/>
@@ -5701,13 +5875,55 @@
         <w:rPr>
           <w:rFonts w:ascii="Cambria" w:hAnsi="Cambria" w:cs="Calibri Light"/>
         </w:rPr>
-        <w:t xml:space="preserve"> persona que lo utilice para fines iguales que mi persona y me comprometo con la </w:t>
+        <w:t xml:space="preserve"> persona que lo </w:t>
       </w:r>
       <w:proofErr w:type="spellStart"/>
       <w:r>
         <w:rPr>
           <w:rFonts w:ascii="Cambria" w:hAnsi="Cambria" w:cs="Calibri Light"/>
         </w:rPr>
+        <w:t>utilice</w:t>
+      </w:r>
+      <w:proofErr w:type="spellEnd"/>
+      <w:r>
+        <w:rPr>
+          <w:rFonts w:ascii="Cambria" w:hAnsi="Cambria" w:cs="Calibri Light"/>
+        </w:rPr>
+        <w:t xml:space="preserve"> para fines </w:t>
+      </w:r>
+      <w:proofErr w:type="spellStart"/>
+      <w:r>
+        <w:rPr>
+          <w:rFonts w:ascii="Cambria" w:hAnsi="Cambria" w:cs="Calibri Light"/>
+        </w:rPr>
+        <w:t>iguales</w:t>
+      </w:r>
+      <w:proofErr w:type="spellEnd"/>
+      <w:r>
+        <w:rPr>
+          <w:rFonts w:ascii="Cambria" w:hAnsi="Cambria" w:cs="Calibri Light"/>
+        </w:rPr>
+        <w:t xml:space="preserve"> que mi persona y me </w:t>
+      </w:r>
+      <w:proofErr w:type="spellStart"/>
+      <w:r>
+        <w:rPr>
+          <w:rFonts w:ascii="Cambria" w:hAnsi="Cambria" w:cs="Calibri Light"/>
+        </w:rPr>
+        <w:t>comprometo</w:t>
+      </w:r>
+      <w:proofErr w:type="spellEnd"/>
+      <w:r>
+        <w:rPr>
+          <w:rFonts w:ascii="Cambria" w:hAnsi="Cambria" w:cs="Calibri Light"/>
+        </w:rPr>
+        <w:t xml:space="preserve"> con la </w:t>
+      </w:r>
+      <w:proofErr w:type="spellStart"/>
+      <w:r>
+        <w:rPr>
+          <w:rFonts w:ascii="Cambria" w:hAnsi="Cambria" w:cs="Calibri Light"/>
+        </w:rPr>
         <w:t>empresa</w:t>
       </w:r>
       <w:proofErr w:type="spellEnd"/>
@@ -5772,7 +5988,105 @@
         <w:rPr>
           <w:rFonts w:ascii="Cambria" w:hAnsi="Cambria" w:cs="Calibri Light"/>
         </w:rPr>
-        <w:t xml:space="preserve"> que por la precitada comision del hecho puede dar lugar:</w:t>
+        <w:t xml:space="preserve"> que </w:t>
+      </w:r>
+      <w:proofErr w:type="spellStart"/>
+      <w:r>
+        <w:rPr>
+          <w:rFonts w:ascii="Cambria" w:hAnsi="Cambria" w:cs="Calibri Light"/>
+        </w:rPr>
+        <w:t>por</w:t>
+      </w:r>
+      <w:proofErr w:type="spellEnd"/>
+      <w:r>
+        <w:rPr>
+          <w:rFonts w:ascii="Cambria" w:hAnsi="Cambria" w:cs="Calibri Light"/>
+        </w:rPr>
+        <w:t xml:space="preserve"> la </w:t>
+      </w:r>
+      <w:proofErr w:type="spellStart"/>
+      <w:r>
+        <w:rPr>
+          <w:rFonts w:ascii="Cambria" w:hAnsi="Cambria" w:cs="Calibri Light"/>
+        </w:rPr>
+        <w:t>precitada</w:t>
+      </w:r>
+      <w:proofErr w:type="spellEnd"/>
+      <w:r>
+        <w:rPr>
+          <w:rFonts w:ascii="Cambria" w:hAnsi="Cambria" w:cs="Calibri Light"/>
+        </w:rPr>
+        <w:t xml:space="preserve"> </w:t>
+      </w:r>
+      <w:proofErr w:type="spellStart"/>
+      <w:r>
+        <w:rPr>
+          <w:rFonts w:ascii="Cambria" w:hAnsi="Cambria" w:cs="Calibri Light"/>
+        </w:rPr>
+        <w:t>comision</w:t>
+      </w:r>
+      <w:proofErr w:type="spellEnd"/>
+      <w:r>
+        <w:rPr>
+          <w:rFonts w:ascii="Cambria" w:hAnsi="Cambria" w:cs="Calibri Light"/>
+        </w:rPr>
+        <w:t xml:space="preserve"> </w:t>
+      </w:r>
+      <w:proofErr w:type="spellStart"/>
+      <w:r>
+        <w:rPr>
+          <w:rFonts w:ascii="Cambria" w:hAnsi="Cambria" w:cs="Calibri Light"/>
+        </w:rPr>
+        <w:t>del</w:t>
+      </w:r>
+      <w:proofErr w:type="spellEnd"/>
+      <w:r>
+        <w:rPr>
+          <w:rFonts w:ascii="Cambria" w:hAnsi="Cambria" w:cs="Calibri Light"/>
+        </w:rPr>
+        <w:t xml:space="preserve"> </w:t>
+      </w:r>
+      <w:proofErr w:type="spellStart"/>
+      <w:r>
+        <w:rPr>
+          <w:rFonts w:ascii="Cambria" w:hAnsi="Cambria" w:cs="Calibri Light"/>
+        </w:rPr>
+        <w:t>hecho</w:t>
+      </w:r>
+      <w:proofErr w:type="spellEnd"/>
+      <w:r>
+        <w:rPr>
+          <w:rFonts w:ascii="Cambria" w:hAnsi="Cambria" w:cs="Calibri Light"/>
+        </w:rPr>
+        <w:t xml:space="preserve"> </w:t>
+      </w:r>
+      <w:proofErr w:type="spellStart"/>
+      <w:r>
+        <w:rPr>
+          <w:rFonts w:ascii="Cambria" w:hAnsi="Cambria" w:cs="Calibri Light"/>
+        </w:rPr>
+        <w:t>puede</w:t>
+      </w:r>
+      <w:proofErr w:type="spellEnd"/>
+      <w:r>
+        <w:rPr>
+          <w:rFonts w:ascii="Cambria" w:hAnsi="Cambria" w:cs="Calibri Light"/>
+        </w:rPr>
+        <w:t xml:space="preserve"> dar </w:t>
+      </w:r>
+      <w:proofErr w:type="spellStart"/>
+      <w:r>
+        <w:rPr>
+          <w:rFonts w:ascii="Cambria" w:hAnsi="Cambria" w:cs="Calibri Light"/>
+        </w:rPr>
+        <w:t>lugar</w:t>
+      </w:r>
+      <w:proofErr w:type="spellEnd"/>
+      <w:r>
+        <w:rPr>
+          <w:rFonts w:ascii="Cambria" w:hAnsi="Cambria" w:cs="Calibri Light"/>
+        </w:rPr>
+        <w:t>:</w:t>
       </w:r>
     </w:p>
     <w:p>
@@ -5804,7 +6118,103 @@
           <w:rFonts w:ascii="Cambria" w:hAnsi="Cambria" w:cs="Calibri Light"/>
           <w:b/>
         </w:rPr>
-        <w:t>A la perdida inmediata del derecho a operar la mencionada unidad.</w:t>
+        <w:t xml:space="preserve">A la </w:t>
+      </w:r>
+      <w:proofErr w:type="spellStart"/>
+      <w:r>
+        <w:rPr>
+          <w:rFonts w:ascii="Cambria" w:hAnsi="Cambria" w:cs="Calibri Light"/>
+          <w:b/>
+        </w:rPr>
+        <w:t>perdida</w:t>
+      </w:r>
+      <w:proofErr w:type="spellEnd"/>
+      <w:r>
+        <w:rPr>
+          <w:rFonts w:ascii="Cambria" w:hAnsi="Cambria" w:cs="Calibri Light"/>
+          <w:b/>
+        </w:rPr>
+        <w:t xml:space="preserve"> </w:t>
+      </w:r>
+      <w:proofErr w:type="spellStart"/>
+      <w:r>
+        <w:rPr>
+          <w:rFonts w:ascii="Cambria" w:hAnsi="Cambria" w:cs="Calibri Light"/>
+          <w:b/>
+        </w:rPr>
+        <w:t>inmediata</w:t>
+      </w:r>
+      <w:proofErr w:type="spellEnd"/>
+      <w:r>
+        <w:rPr>
+          <w:rFonts w:ascii="Cambria" w:hAnsi="Cambria" w:cs="Calibri Light"/>
+          <w:b/>
+        </w:rPr>
+        <w:t xml:space="preserve"> </w:t>
+      </w:r>
+      <w:proofErr w:type="spellStart"/>
+      <w:r>
+        <w:rPr>
+          <w:rFonts w:ascii="Cambria" w:hAnsi="Cambria" w:cs="Calibri Light"/>
+          <w:b/>
+        </w:rPr>
+        <w:t>del</w:t>
+      </w:r>
+      <w:proofErr w:type="spellEnd"/>
+      <w:r>
+        <w:rPr>
+          <w:rFonts w:ascii="Cambria" w:hAnsi="Cambria" w:cs="Calibri Light"/>
+          <w:b/>
+        </w:rPr>
+        <w:t xml:space="preserve"> derecho a </w:t>
+      </w:r>
+      <w:proofErr w:type="spellStart"/>
+      <w:r>
+        <w:rPr>
+          <w:rFonts w:ascii="Cambria" w:hAnsi="Cambria" w:cs="Calibri Light"/>
+          <w:b/>
+        </w:rPr>
+        <w:t>operar</w:t>
+      </w:r>
+      <w:proofErr w:type="spellEnd"/>
+      <w:r>
+        <w:rPr>
+          <w:rFonts w:ascii="Cambria" w:hAnsi="Cambria" w:cs="Calibri Light"/>
+          <w:b/>
+        </w:rPr>
+        <w:t xml:space="preserve"> la </w:t>
+      </w:r>
+      <w:proofErr w:type="spellStart"/>
+      <w:r>
+        <w:rPr>
+          <w:rFonts w:ascii="Cambria" w:hAnsi="Cambria" w:cs="Calibri Light"/>
+          <w:b/>
+        </w:rPr>
+        <w:t>mencionada</w:t>
+      </w:r>
+      <w:proofErr w:type="spellEnd"/>
+      <w:r>
+        <w:rPr>
+          <w:rFonts w:ascii="Cambria" w:hAnsi="Cambria" w:cs="Calibri Light"/>
+          <w:b/>
+        </w:rPr>
+        <w:t xml:space="preserve"> </w:t>
+      </w:r>
+      <w:proofErr w:type="spellStart"/>
+      <w:r>
+        <w:rPr>
+          <w:rFonts w:ascii="Cambria" w:hAnsi="Cambria" w:cs="Calibri Light"/>
+          <w:b/>
+        </w:rPr>
+        <w:t>unidad</w:t>
+      </w:r>
+      <w:proofErr w:type="spellEnd"/>
+      <w:r>
+        <w:rPr>
+          <w:rFonts w:ascii="Cambria" w:hAnsi="Cambria" w:cs="Calibri Light"/>
+          <w:b/>
+        </w:rPr>
+        <w:t>.</w:t>
       </w:r>
     </w:p>
     <w:p>
@@ -5821,13 +6231,143 @@
           <w:b/>
         </w:rPr>
       </w:pPr>
-      <w:r>
-        <w:rPr>
-          <w:rFonts w:ascii="Cambria" w:hAnsi="Cambria" w:cs="Calibri Light"/>
-          <w:b/>
-        </w:rPr>
-        <w:t>Ser sujeto penal de denuncia por hurto o robo del vehiculo</w:t>
-      </w:r>
+      <w:proofErr w:type="spellStart"/>
+      <w:r>
+        <w:rPr>
+          <w:rFonts w:ascii="Cambria" w:hAnsi="Cambria" w:cs="Calibri Light"/>
+          <w:b/>
+        </w:rPr>
+        <w:t>Ser</w:t>
+      </w:r>
+      <w:proofErr w:type="spellEnd"/>
+      <w:r>
+        <w:rPr>
+          <w:rFonts w:ascii="Cambria" w:hAnsi="Cambria" w:cs="Calibri Light"/>
+          <w:b/>
+        </w:rPr>
+        <w:t xml:space="preserve"> </w:t>
+      </w:r>
+      <w:proofErr w:type="spellStart"/>
+      <w:r>
+        <w:rPr>
+          <w:rFonts w:ascii="Cambria" w:hAnsi="Cambria" w:cs="Calibri Light"/>
+          <w:b/>
+        </w:rPr>
+        <w:t>sujeto</w:t>
+      </w:r>
+      <w:proofErr w:type="spellEnd"/>
+      <w:r>
+        <w:rPr>
+          <w:rFonts w:ascii="Cambria" w:hAnsi="Cambria" w:cs="Calibri Light"/>
+          <w:b/>
+        </w:rPr>
+        <w:t xml:space="preserve"> </w:t>
+      </w:r>
+      <w:proofErr w:type="spellStart"/>
+      <w:r>
+        <w:rPr>
+          <w:rFonts w:ascii="Cambria" w:hAnsi="Cambria" w:cs="Calibri Light"/>
+          <w:b/>
+        </w:rPr>
+        <w:t>penal</w:t>
+      </w:r>
+      <w:proofErr w:type="spellEnd"/>
+      <w:r>
+        <w:rPr>
+          <w:rFonts w:ascii="Cambria" w:hAnsi="Cambria" w:cs="Calibri Light"/>
+          <w:b/>
+        </w:rPr>
+        <w:t xml:space="preserve"> de </w:t>
+      </w:r>
+      <w:proofErr w:type="spellStart"/>
+      <w:r>
+        <w:rPr>
+          <w:rFonts w:ascii="Cambria" w:hAnsi="Cambria" w:cs="Calibri Light"/>
+          <w:b/>
+        </w:rPr>
+        <w:t>denuncia</w:t>
+      </w:r>
+      <w:proofErr w:type="spellEnd"/>
+      <w:r>
+        <w:rPr>
+          <w:rFonts w:ascii="Cambria" w:hAnsi="Cambria" w:cs="Calibri Light"/>
+          <w:b/>
+        </w:rPr>
+        <w:t xml:space="preserve"> </w:t>
+      </w:r>
+      <w:proofErr w:type="spellStart"/>
+      <w:r>
+        <w:rPr>
+          <w:rFonts w:ascii="Cambria" w:hAnsi="Cambria" w:cs="Calibri Light"/>
+          <w:b/>
+        </w:rPr>
+        <w:t>por</w:t>
+      </w:r>
+      <w:proofErr w:type="spellEnd"/>
+      <w:r>
+        <w:rPr>
+          <w:rFonts w:ascii="Cambria" w:hAnsi="Cambria" w:cs="Calibri Light"/>
+          <w:b/>
+        </w:rPr>
+        <w:t xml:space="preserve"> </w:t>
+      </w:r>
+      <w:proofErr w:type="spellStart"/>
+      <w:r>
+        <w:rPr>
+          <w:rFonts w:ascii="Cambria" w:hAnsi="Cambria" w:cs="Calibri Light"/>
+          <w:b/>
+        </w:rPr>
+        <w:t>hurto</w:t>
+      </w:r>
+      <w:proofErr w:type="spellEnd"/>
+      <w:r>
+        <w:rPr>
+          <w:rFonts w:ascii="Cambria" w:hAnsi="Cambria" w:cs="Calibri Light"/>
+          <w:b/>
+        </w:rPr>
+        <w:t xml:space="preserve"> o </w:t>
+      </w:r>
+      <w:proofErr w:type="spellStart"/>
+      <w:r>
+        <w:rPr>
+          <w:rFonts w:ascii="Cambria" w:hAnsi="Cambria" w:cs="Calibri Light"/>
+          <w:b/>
+        </w:rPr>
+        <w:t>robo</w:t>
+      </w:r>
+      <w:proofErr w:type="spellEnd"/>
+      <w:r>
+        <w:rPr>
+          <w:rFonts w:ascii="Cambria" w:hAnsi="Cambria" w:cs="Calibri Light"/>
+          <w:b/>
+        </w:rPr>
+        <w:t xml:space="preserve"> </w:t>
+      </w:r>
+      <w:proofErr w:type="spellStart"/>
+      <w:r>
+        <w:rPr>
+          <w:rFonts w:ascii="Cambria" w:hAnsi="Cambria" w:cs="Calibri Light"/>
+          <w:b/>
+        </w:rPr>
+        <w:t>del</w:t>
+      </w:r>
+      <w:proofErr w:type="spellEnd"/>
+      <w:r>
+        <w:rPr>
+          <w:rFonts w:ascii="Cambria" w:hAnsi="Cambria" w:cs="Calibri Light"/>
+          <w:b/>
+        </w:rPr>
+        <w:t xml:space="preserve"> </w:t>
+      </w:r>
+      <w:proofErr w:type="spellStart"/>
+      <w:r>
+        <w:rPr>
+          <w:rFonts w:ascii="Cambria" w:hAnsi="Cambria" w:cs="Calibri Light"/>
+          <w:b/>
+        </w:rPr>
+        <w:t>vehiculo</w:t>
+      </w:r>
+      <w:proofErr w:type="spellEnd"/>
     </w:p>
     <w:p>
       <w:pPr>
@@ -5843,13 +6383,95 @@
           <w:b/>
         </w:rPr>
       </w:pPr>
-      <w:r>
-        <w:rPr>
-          <w:rFonts w:ascii="Cambria" w:hAnsi="Cambria" w:cs="Calibri Light"/>
-          <w:b/>
-        </w:rPr>
-        <w:t>Responsabilidad civil por los daños que sufra el vehicuo o a terceros</w:t>
-      </w:r>
+      <w:proofErr w:type="spellStart"/>
+      <w:r>
+        <w:rPr>
+          <w:rFonts w:ascii="Cambria" w:hAnsi="Cambria" w:cs="Calibri Light"/>
+          <w:b/>
+        </w:rPr>
+        <w:t>Responsabilidad</w:t>
+      </w:r>
+      <w:proofErr w:type="spellEnd"/>
+      <w:r>
+        <w:rPr>
+          <w:rFonts w:ascii="Cambria" w:hAnsi="Cambria" w:cs="Calibri Light"/>
+          <w:b/>
+        </w:rPr>
+        <w:t xml:space="preserve"> civil </w:t>
+      </w:r>
+      <w:proofErr w:type="spellStart"/>
+      <w:r>
+        <w:rPr>
+          <w:rFonts w:ascii="Cambria" w:hAnsi="Cambria" w:cs="Calibri Light"/>
+          <w:b/>
+        </w:rPr>
+        <w:t>por</w:t>
+      </w:r>
+      <w:proofErr w:type="spellEnd"/>
+      <w:r>
+        <w:rPr>
+          <w:rFonts w:ascii="Cambria" w:hAnsi="Cambria" w:cs="Calibri Light"/>
+          <w:b/>
+        </w:rPr>
+        <w:t xml:space="preserve"> los </w:t>
+      </w:r>
+      <w:proofErr w:type="spellStart"/>
+      <w:r>
+        <w:rPr>
+          <w:rFonts w:ascii="Cambria" w:hAnsi="Cambria" w:cs="Calibri Light"/>
+          <w:b/>
+        </w:rPr>
+        <w:t>daños</w:t>
+      </w:r>
+      <w:proofErr w:type="spellEnd"/>
+      <w:r>
+        <w:rPr>
+          <w:rFonts w:ascii="Cambria" w:hAnsi="Cambria" w:cs="Calibri Light"/>
+          <w:b/>
+        </w:rPr>
+        <w:t xml:space="preserve"> que </w:t>
+      </w:r>
+      <w:proofErr w:type="spellStart"/>
+      <w:r>
+        <w:rPr>
+          <w:rFonts w:ascii="Cambria" w:hAnsi="Cambria" w:cs="Calibri Light"/>
+          <w:b/>
+        </w:rPr>
+        <w:t>sufra</w:t>
+      </w:r>
+      <w:proofErr w:type="spellEnd"/>
+      <w:r>
+        <w:rPr>
+          <w:rFonts w:ascii="Cambria" w:hAnsi="Cambria" w:cs="Calibri Light"/>
+          <w:b/>
+        </w:rPr>
+        <w:t xml:space="preserve"> el </w:t>
+      </w:r>
+      <w:proofErr w:type="spellStart"/>
+      <w:r>
+        <w:rPr>
+          <w:rFonts w:ascii="Cambria" w:hAnsi="Cambria" w:cs="Calibri Light"/>
+          <w:b/>
+        </w:rPr>
+        <w:t>vehicuo</w:t>
+      </w:r>
+      <w:proofErr w:type="spellEnd"/>
+      <w:r>
+        <w:rPr>
+          <w:rFonts w:ascii="Cambria" w:hAnsi="Cambria" w:cs="Calibri Light"/>
+          <w:b/>
+        </w:rPr>
+        <w:t xml:space="preserve"> o a </w:t>
+      </w:r>
+      <w:proofErr w:type="spellStart"/>
+      <w:r>
+        <w:rPr>
+          <w:rFonts w:ascii="Cambria" w:hAnsi="Cambria" w:cs="Calibri Light"/>
+          <w:b/>
+        </w:rPr>
+        <w:t>terceros</w:t>
+      </w:r>
+      <w:proofErr w:type="spellEnd"/>
     </w:p>
     <w:p>
       <w:pPr>
@@ -6009,7 +6631,6 @@
         <w:t>nMes</w:t>
       </w:r>
       <w:proofErr w:type="spellEnd"/>
-      <w:proofErr w:type="gramStart"/>
       <w:r>
         <w:rPr>
           <w:rFonts w:ascii="Cambria" w:hAnsi="Cambria" w:cs="Calibri Light"/>
@@ -6023,14 +6644,7 @@
         <w:rPr>
           <w:rFonts w:ascii="Cambria" w:hAnsi="Cambria" w:cs="Calibri Light"/>
         </w:rPr>
-        <w:t xml:space="preserve">  de</w:t>
-      </w:r>
-      <w:proofErr w:type="gramEnd"/>
-      <w:r>
-        <w:rPr>
-          <w:rFonts w:ascii="Cambria" w:hAnsi="Cambria" w:cs="Calibri Light"/>
-        </w:rPr>
-        <w:t xml:space="preserve"> </w:t>
+        <w:t xml:space="preserve">  de </w:t>
       </w:r>
       <w:r>
         <w:rPr>
@@ -6177,7 +6791,7 @@
     </w:p>
     <w:p>
       <w:pPr>
-        <w:spacing w:after="0" w:line="240" w:lineRule="auto"/>
+        <w:spacing w:after="0" w:line="280" w:lineRule="exact"/>
         <w:rPr>
           <w:rFonts w:ascii="Cambria" w:hAnsi="Cambria" w:cs="Calibri Light"/>
           <w:sz w:val="24"/>
@@ -6349,54 +6963,6 @@
         <w:jc w:val="both"/>
         <w:rPr>
           <w:rFonts w:ascii="Cambria" w:hAnsi="Cambria" w:cs="Calibri Light"/>
-        </w:rPr>
-      </w:pPr>
-    </w:p>
-    <w:p>
-      <w:pPr>
-        <w:spacing w:after="0"/>
-        <w:rPr>
-          <w:rFonts w:ascii="Cambria" w:hAnsi="Cambria" w:cs="Calibri Light"/>
-          <w:b/>
-          <w:sz w:val="24"/>
-          <w:szCs w:val="24"/>
-          <w:u w:val="single"/>
-        </w:rPr>
-      </w:pPr>
-    </w:p>
-    <w:p>
-      <w:pPr>
-        <w:spacing w:after="0"/>
-        <w:rPr>
-          <w:rFonts w:ascii="Cambria" w:hAnsi="Cambria" w:cs="Calibri Light"/>
-          <w:b/>
-          <w:sz w:val="24"/>
-          <w:szCs w:val="24"/>
-          <w:u w:val="single"/>
-        </w:rPr>
-      </w:pPr>
-    </w:p>
-    <w:p>
-      <w:pPr>
-        <w:spacing w:after="0"/>
-        <w:rPr>
-          <w:rFonts w:ascii="Cambria" w:hAnsi="Cambria" w:cs="Calibri Light"/>
-          <w:b/>
-          <w:sz w:val="24"/>
-          <w:szCs w:val="24"/>
-          <w:u w:val="single"/>
-        </w:rPr>
-      </w:pPr>
-    </w:p>
-    <w:p>
-      <w:pPr>
-        <w:spacing w:after="0"/>
-        <w:rPr>
-          <w:rFonts w:ascii="Cambria" w:hAnsi="Cambria" w:cs="Calibri Light"/>
-          <w:b/>
-          <w:sz w:val="24"/>
-          <w:szCs w:val="24"/>
-          <w:u w:val="single"/>
         </w:rPr>
       </w:pPr>
     </w:p>
@@ -6438,7 +7004,7 @@
     </w:p>
     <w:p>
       <w:pPr>
-        <w:spacing w:after="0"/>
+        <w:spacing w:after="0" w:line="240" w:lineRule="auto"/>
         <w:rPr>
           <w:rFonts w:ascii="Cambria" w:hAnsi="Cambria" w:cs="Calibri Light"/>
           <w:b/>
@@ -6447,10 +7013,7 @@
           <w:u w:val="single"/>
         </w:rPr>
       </w:pPr>
-    </w:p>
-    <w:p>
-      <w:pPr>
-        <w:spacing w:after="0"/>
+      <w:r>
         <w:rPr>
           <w:rFonts w:ascii="Cambria" w:hAnsi="Cambria" w:cs="Calibri Light"/>
           <w:b/>
@@ -6458,19 +7021,8 @@
           <w:szCs w:val="20"/>
           <w:u w:val="single"/>
         </w:rPr>
-      </w:pPr>
-    </w:p>
-    <w:p>
-      <w:pPr>
-        <w:spacing w:after="0"/>
-        <w:rPr>
-          <w:rFonts w:ascii="Cambria" w:hAnsi="Cambria" w:cs="Calibri Light"/>
-          <w:b/>
-          <w:sz w:val="20"/>
-          <w:szCs w:val="20"/>
-          <w:u w:val="single"/>
-        </w:rPr>
-      </w:pPr>
+        <w:br w:type="page"/>
+      </w:r>
     </w:p>
     <w:p>
       <w:pPr>
@@ -6490,16 +7042,6 @@
           <w:szCs w:val="20"/>
           <w:u w:val="single"/>
         </w:rPr>
-        <w:br w:type="column"/>
-      </w:r>
-      <w:r>
-        <w:rPr>
-          <w:rFonts w:ascii="Cambria" w:hAnsi="Cambria" w:cs="Calibri Light"/>
-          <w:b/>
-          <w:sz w:val="20"/>
-          <w:szCs w:val="20"/>
-          <w:u w:val="single"/>
-        </w:rPr>
         <w:lastRenderedPageBreak/>
         <w:t xml:space="preserve">UNIDAD N° </w:t>
       </w:r>
@@ -6512,7 +7054,29 @@
           <w:u w:val="single"/>
           <w:lang w:val="es-CO"/>
         </w:rPr>
-        <w:t>{{Unidad}}</w:t>
+        <w:t>{{</w:t>
+      </w:r>
+      <w:r>
+        <w:rPr>
+          <w:rFonts w:ascii="Cambria" w:hAnsi="Cambria" w:cs="Calibri Light"/>
+          <w:b/>
+          <w:sz w:val="20"/>
+          <w:szCs w:val="20"/>
+          <w:u w:val="single"/>
+          <w:lang w:val="es-CO"/>
+        </w:rPr>
+        <w:t>Unidad</w:t>
+      </w:r>
+      <w:r>
+        <w:rPr>
+          <w:rFonts w:ascii="Cambria" w:hAnsi="Cambria" w:cs="Calibri Light"/>
+          <w:b/>
+          <w:sz w:val="20"/>
+          <w:szCs w:val="20"/>
+          <w:u w:val="single"/>
+          <w:lang w:val="es-CO"/>
+        </w:rPr>
+        <w:t>}}</w:t>
       </w:r>
       <w:r>
         <w:rPr>
@@ -6559,29 +7123,7 @@
           <w:szCs w:val="20"/>
           <w:u w:val="single"/>
         </w:rPr>
-        <w:t xml:space="preserve">Operador </w:t>
-      </w:r>
-      <w:proofErr w:type="spellStart"/>
-      <w:r>
-        <w:rPr>
-          <w:rFonts w:ascii="Cambria" w:hAnsi="Cambria" w:cs="Calibri Light"/>
-          <w:b/>
-          <w:sz w:val="20"/>
-          <w:szCs w:val="20"/>
-          <w:u w:val="single"/>
-        </w:rPr>
-        <w:t>N°</w:t>
-      </w:r>
-      <w:proofErr w:type="spellEnd"/>
-      <w:r>
-        <w:rPr>
-          <w:rFonts w:ascii="Cambria" w:hAnsi="Cambria" w:cs="Calibri Light"/>
-          <w:b/>
-          <w:sz w:val="20"/>
-          <w:szCs w:val="20"/>
-          <w:u w:val="single"/>
-        </w:rPr>
-        <w:t xml:space="preserve"> </w:t>
+        <w:t xml:space="preserve">Operador N° </w:t>
       </w:r>
       <w:r>
         <w:rPr>
@@ -6716,7 +7258,6 @@
         </w:rPr>
         <w:t xml:space="preserve">Nro. DE UNIDAD: </w:t>
       </w:r>
-      <w:proofErr w:type="gramStart"/>
       <w:r>
         <w:rPr>
           <w:rFonts w:ascii="Cambria" w:eastAsia="Cambria" w:hAnsi="Cambria" w:cs="Calibri Light"/>
@@ -6734,9 +7275,8 @@
           <w:sz w:val="24"/>
           <w:szCs w:val="24"/>
         </w:rPr>
-        <w:t>{</w:t>
-      </w:r>
-      <w:proofErr w:type="gramEnd"/>
+        <w:t>{{</w:t>
+      </w:r>
       <w:r>
         <w:rPr>
           <w:rFonts w:ascii="Cambria" w:eastAsia="Cambria" w:hAnsi="Cambria" w:cs="Calibri Light"/>
@@ -6744,7 +7284,16 @@
           <w:sz w:val="24"/>
           <w:szCs w:val="24"/>
         </w:rPr>
-        <w:t>{Unidad}}</w:t>
+        <w:t>Unidad</w:t>
+      </w:r>
+      <w:r>
+        <w:rPr>
+          <w:rFonts w:ascii="Cambria" w:eastAsia="Cambria" w:hAnsi="Cambria" w:cs="Calibri Light"/>
+          <w:b/>
+          <w:sz w:val="24"/>
+          <w:szCs w:val="24"/>
+        </w:rPr>
+        <w:t>}}</w:t>
       </w:r>
     </w:p>
     <w:p>
@@ -6774,9 +7323,8 @@
           <w:sz w:val="24"/>
           <w:szCs w:val="24"/>
         </w:rPr>
-        <w:t>Nro. DE PANAPASS</w:t>
-      </w:r>
-      <w:proofErr w:type="gramStart"/>
+        <w:t xml:space="preserve">Nro. DE PANAPASS:  </w:t>
+      </w:r>
       <w:r>
         <w:rPr>
           <w:rFonts w:ascii="Cambria" w:eastAsia="Cambria" w:hAnsi="Cambria" w:cs="Calibri Light"/>
@@ -6784,26 +7332,7 @@
           <w:sz w:val="24"/>
           <w:szCs w:val="24"/>
         </w:rPr>
-        <w:t xml:space="preserve">:  </w:t>
-      </w:r>
-      <w:r>
-        <w:rPr>
-          <w:rFonts w:ascii="Cambria" w:eastAsia="Cambria" w:hAnsi="Cambria" w:cs="Calibri Light"/>
-          <w:b/>
-          <w:sz w:val="24"/>
-          <w:szCs w:val="24"/>
-        </w:rPr>
-        <w:t>{</w:t>
-      </w:r>
-      <w:proofErr w:type="gramEnd"/>
-      <w:r>
-        <w:rPr>
-          <w:rFonts w:ascii="Cambria" w:eastAsia="Cambria" w:hAnsi="Cambria" w:cs="Calibri Light"/>
-          <w:b/>
-          <w:sz w:val="24"/>
-          <w:szCs w:val="24"/>
-        </w:rPr>
-        <w:t>{</w:t>
+        <w:t>{{</w:t>
       </w:r>
       <w:proofErr w:type="spellStart"/>
       <w:r>
@@ -7063,7 +7592,6 @@
         <w:t>nMes</w:t>
       </w:r>
       <w:proofErr w:type="spellEnd"/>
-      <w:proofErr w:type="gramStart"/>
       <w:r>
         <w:rPr>
           <w:rFonts w:ascii="Cambria" w:hAnsi="Cambria" w:cs="Calibri Light"/>
@@ -7081,16 +7609,7 @@
           <w:sz w:val="24"/>
           <w:szCs w:val="24"/>
         </w:rPr>
-        <w:t xml:space="preserve">  de</w:t>
-      </w:r>
-      <w:proofErr w:type="gramEnd"/>
-      <w:r>
-        <w:rPr>
-          <w:rFonts w:ascii="Cambria" w:hAnsi="Cambria" w:cs="Calibri Light"/>
-          <w:sz w:val="24"/>
-          <w:szCs w:val="24"/>
-        </w:rPr>
-        <w:t xml:space="preserve"> </w:t>
+        <w:t xml:space="preserve">  de </w:t>
       </w:r>
       <w:r>
         <w:rPr>
@@ -7263,27 +7782,7 @@
           <w:szCs w:val="24"/>
           <w:lang w:val="es-MX"/>
         </w:rPr>
-        <w:t xml:space="preserve">, a fin de aceptar bajo la gravedad del juramento y con conocimiento de la responsabilidad penal, civil y administrativa </w:t>
-      </w:r>
-      <w:proofErr w:type="gramStart"/>
-      <w:r>
-        <w:rPr>
-          <w:rFonts w:ascii="Cambria" w:hAnsi="Cambria" w:cs="Calibri Light"/>
-          <w:sz w:val="24"/>
-          <w:szCs w:val="24"/>
-          <w:lang w:val="es-MX"/>
-        </w:rPr>
-        <w:t>en caso que</w:t>
-      </w:r>
-      <w:proofErr w:type="gramEnd"/>
-      <w:r>
-        <w:rPr>
-          <w:rFonts w:ascii="Cambria" w:hAnsi="Cambria" w:cs="Calibri Light"/>
-          <w:sz w:val="24"/>
-          <w:szCs w:val="24"/>
-          <w:lang w:val="es-MX"/>
-        </w:rPr>
-        <w:t xml:space="preserve"> cometa la INFRACCION DE TRANSITO NO.71 AL DECRETO EJECUTIVO 640 DE 27 DE DICIEMBRE DEL 2006 lo siguiente:</w:t>
+        <w:t>, a fin de aceptar bajo la gravedad del juramento y con conocimiento de la responsabilidad penal, civil y administrativa en caso que cometa la INFRACCION DE TRANSITO NO.71 AL DECRETO EJECUTIVO 640 DE 27 DE DICIEMBRE DEL 2006 lo siguiente:</w:t>
       </w:r>
     </w:p>
     <w:p>
@@ -7339,7 +7838,6 @@
         </w:rPr>
         <w:t>Placa</w:t>
       </w:r>
-      <w:proofErr w:type="gramStart"/>
       <w:r>
         <w:rPr>
           <w:rFonts w:ascii="Cambria" w:hAnsi="Cambria" w:cs="Calibri Light"/>
@@ -7366,17 +7864,7 @@
           <w:szCs w:val="24"/>
           <w:lang w:val="es-MX"/>
         </w:rPr>
-        <w:t xml:space="preserve"> y</w:t>
-      </w:r>
-      <w:proofErr w:type="gramEnd"/>
-      <w:r>
-        <w:rPr>
-          <w:rFonts w:ascii="Cambria" w:hAnsi="Cambria" w:cs="Calibri Light"/>
-          <w:sz w:val="24"/>
-          <w:szCs w:val="24"/>
-          <w:lang w:val="es-MX"/>
-        </w:rPr>
-        <w:t xml:space="preserve"> que dentro del mismo se establece una cláusula compromisoria que me impide cometer la infracción establecida</w:t>
+        <w:t xml:space="preserve"> y que dentro del mismo se establece una cláusula compromisoria que me impide cometer la infracción establecida</w:t>
       </w:r>
       <w:r>
         <w:rPr>
@@ -8836,7 +9324,27 @@
           <w:szCs w:val="24"/>
           <w:lang w:val="es-MX"/>
         </w:rPr>
-        <w:t>presente documento en caso de proporcionarme el beneficio de la continuidad contractual a pesar de la falta, me notificara mediante estado de cuenta o historial de transito de la cantidad mensual a cancelar incluida en el renglón de siniestros.</w:t>
+        <w:t xml:space="preserve">presente documento en caso de proporcionarme el beneficio de la continuidad contractual a pesar de la falta, me notificara mediante estado de cuenta o historial de </w:t>
+      </w:r>
+      <w:proofErr w:type="spellStart"/>
+      <w:r>
+        <w:rPr>
+          <w:rFonts w:ascii="Cambria" w:hAnsi="Cambria" w:cs="Calibri Light"/>
+          <w:sz w:val="24"/>
+          <w:szCs w:val="24"/>
+          <w:lang w:val="es-MX"/>
+        </w:rPr>
+        <w:t>transito</w:t>
+      </w:r>
+      <w:proofErr w:type="spellEnd"/>
+      <w:r>
+        <w:rPr>
+          <w:rFonts w:ascii="Cambria" w:hAnsi="Cambria" w:cs="Calibri Light"/>
+          <w:sz w:val="24"/>
+          <w:szCs w:val="24"/>
+          <w:lang w:val="es-MX"/>
+        </w:rPr>
+        <w:t xml:space="preserve"> de la cantidad mensual a cancelar incluida en el renglón de siniestros.</w:t>
       </w:r>
     </w:p>
     <w:p>
@@ -8984,192 +9492,213 @@
     </w:p>
     <w:p>
       <w:pPr>
+        <w:spacing w:after="0" w:line="322" w:lineRule="auto"/>
+        <w:jc w:val="both"/>
+        <w:rPr>
+          <w:rFonts w:ascii="Cambria" w:hAnsi="Cambria" w:cs="Calibri Light"/>
+          <w:sz w:val="24"/>
+          <w:szCs w:val="24"/>
+          <w:lang w:val="es-MX"/>
+        </w:rPr>
+      </w:pPr>
+    </w:p>
+    <w:p>
+      <w:pPr>
+        <w:pStyle w:val="Textbody"/>
+        <w:spacing w:after="0"/>
+        <w:jc w:val="both"/>
+        <w:rPr>
+          <w:rFonts w:ascii="Cambria" w:hAnsi="Cambria" w:cs="Calibri Light"/>
+        </w:rPr>
+      </w:pPr>
+      <w:r>
+        <w:rPr>
+          <w:rFonts w:ascii="Cambria" w:hAnsi="Cambria" w:cs="Calibri Light"/>
+        </w:rPr>
+        <w:t>{{</w:t>
+      </w:r>
+      <w:proofErr w:type="spellStart"/>
+      <w:r>
+        <w:rPr>
+          <w:rFonts w:ascii="Cambria" w:hAnsi="Cambria" w:cs="Calibri Light"/>
+        </w:rPr>
+        <w:t>Firma</w:t>
+      </w:r>
+      <w:proofErr w:type="spellEnd"/>
+      <w:r>
+        <w:rPr>
+          <w:rFonts w:ascii="Cambria" w:hAnsi="Cambria" w:cs="Calibri Light"/>
+        </w:rPr>
+        <w:t>}}</w:t>
+      </w:r>
+    </w:p>
+    <w:p>
+      <w:pPr>
+        <w:spacing w:after="0" w:line="322" w:lineRule="auto"/>
+        <w:jc w:val="both"/>
+        <w:rPr>
+          <w:rFonts w:ascii="Cambria" w:hAnsi="Cambria" w:cs="Calibri Light"/>
+          <w:sz w:val="24"/>
+          <w:szCs w:val="24"/>
+          <w:lang w:val="es-MX"/>
+        </w:rPr>
+      </w:pPr>
+      <w:r>
+        <w:rPr>
+          <w:rFonts w:ascii="Cambria" w:hAnsi="Cambria" w:cs="Calibri Light"/>
+          <w:sz w:val="24"/>
+          <w:szCs w:val="24"/>
+          <w:lang w:val="es-MX"/>
+        </w:rPr>
+        <w:t>____</w:t>
+      </w:r>
+      <w:r>
+        <w:rPr>
+          <w:rFonts w:ascii="Cambria" w:hAnsi="Cambria" w:cs="Calibri Light"/>
+          <w:sz w:val="24"/>
+          <w:szCs w:val="24"/>
+          <w:lang w:val="es-MX"/>
+        </w:rPr>
+        <w:t>______________________________________</w:t>
+      </w:r>
+    </w:p>
+    <w:p>
+      <w:pPr>
+        <w:pStyle w:val="Textbody"/>
+        <w:spacing w:after="0"/>
+        <w:rPr>
+          <w:rFonts w:ascii="Cambria" w:hAnsi="Cambria" w:cs="Calibri Light"/>
+          <w:b/>
+          <w:bCs/>
+        </w:rPr>
+      </w:pPr>
+      <w:r>
+        <w:rPr>
+          <w:rFonts w:ascii="Cambria" w:hAnsi="Cambria" w:cs="Calibri Light"/>
+          <w:b/>
+          <w:bCs/>
+        </w:rPr>
+        <w:t>{{</w:t>
+      </w:r>
+      <w:r>
+        <w:rPr>
+          <w:rFonts w:ascii="Cambria" w:hAnsi="Cambria" w:cs="Calibri Light"/>
+          <w:b/>
+          <w:bCs/>
+        </w:rPr>
+        <w:t>Nombre</w:t>
+      </w:r>
+      <w:r>
+        <w:rPr>
+          <w:rFonts w:ascii="Cambria" w:hAnsi="Cambria" w:cs="Calibri Light"/>
+          <w:b/>
+          <w:bCs/>
+        </w:rPr>
+        <w:t>}}</w:t>
+      </w:r>
+    </w:p>
+    <w:p>
+      <w:pPr>
+        <w:pStyle w:val="BodyText"/>
+        <w:spacing w:after="0"/>
+        <w:rPr>
+          <w:rFonts w:ascii="Cambria" w:hAnsi="Cambria" w:cs="Calibri Light"/>
+          <w:b/>
+          <w:bCs/>
+          <w:sz w:val="24"/>
+          <w:szCs w:val="24"/>
+        </w:rPr>
+      </w:pPr>
+      <w:r>
+        <w:rPr>
+          <w:rFonts w:ascii="Cambria" w:hAnsi="Cambria" w:cs="Calibri Light"/>
+          <w:sz w:val="24"/>
+          <w:szCs w:val="24"/>
+          <w:lang w:val="es-MX"/>
+        </w:rPr>
+        <w:t xml:space="preserve">Cédula </w:t>
+      </w:r>
+      <w:proofErr w:type="spellStart"/>
+      <w:r>
+        <w:rPr>
+          <w:rFonts w:ascii="Cambria" w:hAnsi="Cambria" w:cs="Calibri Light"/>
+          <w:sz w:val="24"/>
+          <w:szCs w:val="24"/>
+          <w:lang w:val="es-MX"/>
+        </w:rPr>
+        <w:t>Nº</w:t>
+      </w:r>
+      <w:proofErr w:type="spellEnd"/>
+      <w:r>
+        <w:rPr>
+          <w:rFonts w:ascii="Cambria" w:hAnsi="Cambria" w:cs="Calibri Light"/>
+          <w:sz w:val="24"/>
+          <w:szCs w:val="24"/>
+          <w:lang w:val="es-MX"/>
+        </w:rPr>
+        <w:t xml:space="preserve"> </w:t>
+      </w:r>
+      <w:r>
+        <w:rPr>
+          <w:rFonts w:ascii="Cambria" w:hAnsi="Cambria" w:cs="Calibri Light"/>
+          <w:b/>
+          <w:bCs/>
+          <w:sz w:val="24"/>
+          <w:szCs w:val="24"/>
+          <w:lang w:val="es-MX"/>
+        </w:rPr>
+        <w:t>{{</w:t>
+      </w:r>
+      <w:r>
+        <w:rPr>
+          <w:rFonts w:ascii="Cambria" w:hAnsi="Cambria" w:cs="Calibri Light"/>
+          <w:b/>
+          <w:bCs/>
+          <w:sz w:val="24"/>
+          <w:szCs w:val="24"/>
+          <w:lang w:val="es-MX"/>
+        </w:rPr>
+        <w:t>Cedula</w:t>
+      </w:r>
+      <w:r>
+        <w:rPr>
+          <w:rFonts w:ascii="Cambria" w:hAnsi="Cambria" w:cs="Calibri Light"/>
+          <w:b/>
+          <w:bCs/>
+          <w:sz w:val="24"/>
+          <w:szCs w:val="24"/>
+          <w:lang w:val="es-MX"/>
+        </w:rPr>
+        <w:t>}}</w:t>
+      </w:r>
+    </w:p>
+    <w:p>
+      <w:pPr>
+        <w:spacing w:after="0"/>
+        <w:rPr>
+          <w:rFonts w:ascii="Cambria" w:hAnsi="Cambria" w:cs="Calibri Light"/>
+          <w:sz w:val="24"/>
+          <w:szCs w:val="24"/>
+        </w:rPr>
+      </w:pPr>
+    </w:p>
+    <w:p>
+      <w:pPr>
         <w:spacing w:after="0" w:line="240" w:lineRule="auto"/>
         <w:jc w:val="both"/>
         <w:rPr>
-          <w:rFonts w:ascii="Cambria" w:hAnsi="Cambria" w:cs="Calibri Light"/>
-          <w:sz w:val="24"/>
-          <w:szCs w:val="24"/>
-          <w:lang w:val="es-MX"/>
-        </w:rPr>
-      </w:pPr>
-      <w:r>
-        <w:rPr>
-          <w:rFonts w:ascii="Cambria" w:hAnsi="Cambria" w:cs="Calibri Light"/>
-          <w:sz w:val="24"/>
-          <w:szCs w:val="24"/>
-          <w:lang w:val="es-MX"/>
-        </w:rPr>
-        <w:t>{{Firma}}</w:t>
-      </w:r>
+          <w:rFonts w:ascii="Cambria" w:eastAsia="Times New Roman" w:hAnsi="Cambria" w:cs="Arial"/>
+          <w:sz w:val="24"/>
+          <w:szCs w:val="24"/>
+          <w:lang w:eastAsia="es-PA"/>
+        </w:rPr>
+      </w:pPr>
     </w:p>
     <w:p>
       <w:pPr>
         <w:spacing w:after="0" w:line="240" w:lineRule="auto"/>
         <w:jc w:val="both"/>
         <w:rPr>
-          <w:rFonts w:ascii="Cambria" w:hAnsi="Cambria" w:cs="Calibri Light"/>
-          <w:sz w:val="24"/>
-          <w:szCs w:val="24"/>
-          <w:lang w:val="es-MX"/>
-        </w:rPr>
-      </w:pPr>
-      <w:r>
-        <w:rPr>
-          <w:rFonts w:ascii="Cambria" w:hAnsi="Cambria" w:cs="Calibri Light"/>
-          <w:sz w:val="24"/>
-          <w:szCs w:val="24"/>
-          <w:lang w:val="es-MX"/>
-        </w:rPr>
-        <w:t>____</w:t>
-      </w:r>
-      <w:r>
-        <w:rPr>
-          <w:rFonts w:ascii="Cambria" w:hAnsi="Cambria" w:cs="Calibri Light"/>
-          <w:sz w:val="24"/>
-          <w:szCs w:val="24"/>
-          <w:lang w:val="es-MX"/>
-        </w:rPr>
-        <w:t>______________________________________</w:t>
-      </w:r>
-    </w:p>
-    <w:p>
-      <w:pPr>
-        <w:pStyle w:val="Textbody"/>
-        <w:spacing w:after="0"/>
-        <w:rPr>
-          <w:rFonts w:ascii="Cambria" w:hAnsi="Cambria" w:cs="Calibri Light"/>
-          <w:b/>
-          <w:bCs/>
-        </w:rPr>
-      </w:pPr>
-      <w:r>
-        <w:rPr>
-          <w:rFonts w:ascii="Cambria" w:hAnsi="Cambria" w:cs="Calibri Light"/>
-          <w:b/>
-          <w:bCs/>
-        </w:rPr>
-        <w:t>{{</w:t>
-      </w:r>
-      <w:r>
-        <w:rPr>
-          <w:rFonts w:ascii="Cambria" w:hAnsi="Cambria" w:cs="Calibri Light"/>
-          <w:b/>
-          <w:bCs/>
-        </w:rPr>
-        <w:t>Nombre</w:t>
-      </w:r>
-      <w:r>
-        <w:rPr>
-          <w:rFonts w:ascii="Cambria" w:hAnsi="Cambria" w:cs="Calibri Light"/>
-          <w:b/>
-          <w:bCs/>
-        </w:rPr>
-        <w:t>}}</w:t>
-      </w:r>
-    </w:p>
-    <w:p>
-      <w:pPr>
-        <w:pStyle w:val="BodyText"/>
-        <w:spacing w:after="0"/>
-        <w:rPr>
-          <w:rFonts w:ascii="Cambria" w:hAnsi="Cambria" w:cs="Calibri Light"/>
-          <w:b/>
-          <w:bCs/>
-          <w:sz w:val="24"/>
-          <w:szCs w:val="24"/>
-        </w:rPr>
-      </w:pPr>
-      <w:r>
-        <w:rPr>
-          <w:rFonts w:ascii="Cambria" w:hAnsi="Cambria" w:cs="Calibri Light"/>
-          <w:sz w:val="24"/>
-          <w:szCs w:val="24"/>
-          <w:lang w:val="es-MX"/>
-        </w:rPr>
-        <w:t xml:space="preserve">Cédula </w:t>
-      </w:r>
-      <w:proofErr w:type="spellStart"/>
-      <w:r>
-        <w:rPr>
-          <w:rFonts w:ascii="Cambria" w:hAnsi="Cambria" w:cs="Calibri Light"/>
-          <w:sz w:val="24"/>
-          <w:szCs w:val="24"/>
-          <w:lang w:val="es-MX"/>
-        </w:rPr>
-        <w:t>Nº</w:t>
-      </w:r>
-      <w:proofErr w:type="spellEnd"/>
-      <w:r>
-        <w:rPr>
-          <w:rFonts w:ascii="Cambria" w:hAnsi="Cambria" w:cs="Calibri Light"/>
-          <w:sz w:val="24"/>
-          <w:szCs w:val="24"/>
-          <w:lang w:val="es-MX"/>
-        </w:rPr>
-        <w:t xml:space="preserve"> </w:t>
-      </w:r>
-      <w:r>
-        <w:rPr>
-          <w:rFonts w:ascii="Cambria" w:hAnsi="Cambria" w:cs="Calibri Light"/>
-          <w:b/>
-          <w:bCs/>
-          <w:sz w:val="24"/>
-          <w:szCs w:val="24"/>
-          <w:lang w:val="es-MX"/>
-        </w:rPr>
-        <w:t>{{</w:t>
-      </w:r>
-      <w:r>
-        <w:rPr>
-          <w:rFonts w:ascii="Cambria" w:hAnsi="Cambria" w:cs="Calibri Light"/>
-          <w:b/>
-          <w:bCs/>
-          <w:sz w:val="24"/>
-          <w:szCs w:val="24"/>
-          <w:lang w:val="es-MX"/>
-        </w:rPr>
-        <w:t>Cedula</w:t>
-      </w:r>
-      <w:r>
-        <w:rPr>
-          <w:rFonts w:ascii="Cambria" w:hAnsi="Cambria" w:cs="Calibri Light"/>
-          <w:b/>
-          <w:bCs/>
-          <w:sz w:val="24"/>
-          <w:szCs w:val="24"/>
-          <w:lang w:val="es-MX"/>
-        </w:rPr>
-        <w:t>}}</w:t>
-      </w:r>
-    </w:p>
-    <w:p>
-      <w:pPr>
-        <w:spacing w:after="0"/>
-        <w:rPr>
-          <w:rFonts w:ascii="Cambria" w:hAnsi="Cambria" w:cs="Calibri Light"/>
-          <w:sz w:val="24"/>
-          <w:szCs w:val="24"/>
-        </w:rPr>
-      </w:pPr>
-    </w:p>
-    <w:p>
-      <w:pPr>
-        <w:spacing w:after="0" w:line="240" w:lineRule="auto"/>
-        <w:jc w:val="both"/>
-        <w:rPr>
-          <w:rFonts w:ascii="Cambria" w:eastAsia="Times New Roman" w:hAnsi="Cambria" w:cs="Arial"/>
-          <w:sz w:val="24"/>
-          <w:szCs w:val="24"/>
-          <w:lang w:eastAsia="es-PA"/>
-        </w:rPr>
-      </w:pPr>
-    </w:p>
-    <w:p>
-      <w:pPr>
-        <w:spacing w:after="0" w:line="240" w:lineRule="auto"/>
-        <w:jc w:val="both"/>
-        <w:rPr>
           <w:rFonts w:ascii="Cambria" w:eastAsia="Times New Roman" w:hAnsi="Cambria" w:cs="Arial"/>
           <w:sz w:val="24"/>
           <w:szCs w:val="24"/>
@@ -9179,7 +9708,7 @@
     </w:p>
     <w:sectPr>
       <w:pgSz w:w="12240" w:h="15840"/>
-      <w:pgMar w:top="1440" w:right="1440" w:bottom="1440" w:left="1440" w:header="708" w:footer="708" w:gutter="0"/>
+      <w:pgMar w:top="1260" w:right="1440" w:bottom="1440" w:left="1440" w:header="708" w:footer="708" w:gutter="0"/>
       <w:cols w:space="708"/>
       <w:docGrid w:linePitch="360"/>
     </w:sectPr>
@@ -9188,7 +9717,7 @@
 </file>
 
 <file path=word/numbering.xml><?xml version="1.0" encoding="utf-8"?>
-<w:numbering xmlns:wpc="http://schemas.microsoft.com/office/word/2010/wordprocessingCanvas" xmlns:cx="http://schemas.microsoft.com/office/drawing/2014/chartex" xmlns:cx1="http://schemas.microsoft.com/office/drawing/2015/9/8/chartex" xmlns:cx2="http://schemas.microsoft.com/office/drawing/2015/10/21/chartex" xmlns:cx3="http://schemas.microsoft.com/office/drawing/2016/5/9/chartex" xmlns:cx4="http://schemas.microsoft.com/office/drawing/2016/5/10/chartex" xmlns:cx5="http://schemas.microsoft.com/office/drawing/2016/5/11/chartex" xmlns:cx6="http://schemas.microsoft.com/office/drawing/2016/5/12/chartex" xmlns:cx7="http://schemas.microsoft.com/office/drawing/2016/5/13/chartex" xmlns:cx8="http://schemas.microsoft.com/office/drawing/2016/5/14/chartex" xmlns:mc="http://schemas.openxmlformats.org/markup-compatibility/2006" xmlns:aink="http://schemas.microsoft.com/office/drawing/2016/ink" xmlns:am3d="http://schemas.microsoft.com/office/drawing/2017/model3d" xmlns:o="urn:schemas-microsoft-com:office:office" xmlns:oel="http://schemas.microsoft.com/office/2019/extlst" xmlns:r="http://schemas.openxmlformats.org/officeDocument/2006/relationships" xmlns:m="http://schemas.openxmlformats.org/officeDocument/2006/math" xmlns:v="urn:schemas-microsoft-com:vml" xmlns:wp14="http://schemas.microsoft.com/office/word/2010/wordprocessingDrawing" xmlns:wp="http://schemas.openxmlformats.org/drawingml/2006/wordprocessingDrawing" xmlns:w10="urn:schemas-microsoft-com:office:word" xmlns:w="http://schemas.openxmlformats.org/wordprocessingml/2006/main" xmlns:w14="http://schemas.microsoft.com/office/word/2010/wordml" xmlns:w15="http://schemas.microsoft.com/office/word/2012/wordml" xmlns:w16cex="http://schemas.microsoft.com/office/word/2018/wordml/cex" xmlns:w16cid="http://schemas.microsoft.com/office/word/2016/wordml/cid" xmlns:w16="http://schemas.microsoft.com/office/word/2018/wordml" xmlns:w16du="http://schemas.microsoft.com/office/word/2023/wordml/word16du" xmlns:w16sdtdh="http://schemas.microsoft.com/office/word/2020/wordml/sdtdatahash" xmlns:w16sdtfl="http://schemas.microsoft.com/office/word/2024/wordml/sdtformatlock" xmlns:w16se="http://schemas.microsoft.com/office/word/2015/wordml/symex" xmlns:wpg="http://schemas.microsoft.com/office/word/2010/wordprocessingGroup" xmlns:wpi="http://schemas.microsoft.com/office/word/2010/wordprocessingInk" xmlns:wne="http://schemas.microsoft.com/office/word/2006/wordml" xmlns:wps="http://schemas.microsoft.com/office/word/2010/wordprocessingShape" mc:Ignorable="w14 w15 w16se w16cid w16 w16cex w16sdtdh w16sdtfl w16du wp14">
+<w:numbering xmlns:wpc="http://schemas.microsoft.com/office/word/2010/wordprocessingCanvas" xmlns:cx="http://schemas.microsoft.com/office/drawing/2014/chartex" xmlns:cx1="http://schemas.microsoft.com/office/drawing/2015/9/8/chartex" xmlns:cx2="http://schemas.microsoft.com/office/drawing/2015/10/21/chartex" xmlns:cx3="http://schemas.microsoft.com/office/drawing/2016/5/9/chartex" xmlns:cx4="http://schemas.microsoft.com/office/drawing/2016/5/10/chartex" xmlns:cx5="http://schemas.microsoft.com/office/drawing/2016/5/11/chartex" xmlns:cx6="http://schemas.microsoft.com/office/drawing/2016/5/12/chartex" xmlns:cx7="http://schemas.microsoft.com/office/drawing/2016/5/13/chartex" xmlns:cx8="http://schemas.microsoft.com/office/drawing/2016/5/14/chartex" xmlns:mc="http://schemas.openxmlformats.org/markup-compatibility/2006" xmlns:aink="http://schemas.microsoft.com/office/drawing/2016/ink" xmlns:am3d="http://schemas.microsoft.com/office/drawing/2017/model3d" xmlns:o="urn:schemas-microsoft-com:office:office" xmlns:oel="http://schemas.microsoft.com/office/2019/extlst" xmlns:r="http://schemas.openxmlformats.org/officeDocument/2006/relationships" xmlns:m="http://schemas.openxmlformats.org/officeDocument/2006/math" xmlns:v="urn:schemas-microsoft-com:vml" xmlns:wp14="http://schemas.microsoft.com/office/word/2010/wordprocessingDrawing" xmlns:wp="http://schemas.openxmlformats.org/drawingml/2006/wordprocessingDrawing" xmlns:w10="urn:schemas-microsoft-com:office:word" xmlns:w="http://schemas.openxmlformats.org/wordprocessingml/2006/main" xmlns:w14="http://schemas.microsoft.com/office/word/2010/wordml" xmlns:w15="http://schemas.microsoft.com/office/word/2012/wordml" xmlns:w16cex="http://schemas.microsoft.com/office/word/2018/wordml/cex" xmlns:w16cid="http://schemas.microsoft.com/office/word/2016/wordml/cid" xmlns:w16="http://schemas.microsoft.com/office/word/2018/wordml" xmlns:w16sdtdh="http://schemas.microsoft.com/office/word/2020/wordml/sdtdatahash" xmlns:w16se="http://schemas.microsoft.com/office/word/2015/wordml/symex" xmlns:wpg="http://schemas.microsoft.com/office/word/2010/wordprocessingGroup" xmlns:wpi="http://schemas.microsoft.com/office/word/2010/wordprocessingInk" xmlns:wne="http://schemas.microsoft.com/office/word/2006/wordml" xmlns:wps="http://schemas.microsoft.com/office/word/2010/wordprocessingShape" mc:Ignorable="w14 w15 w16se w16cid w16 w16cex w16sdtdh wp14">
   <w:abstractNum w:abstractNumId="0" w15:restartNumberingAfterBreak="0">
     <w:nsid w:val="0D7C7537"/>
     <w:multiLevelType w:val="hybridMultilevel"/>
@@ -11109,56 +11638,56 @@
       </w:rPr>
     </w:lvl>
   </w:abstractNum>
-  <w:num w:numId="1" w16cid:durableId="2010981978">
+  <w:num w:numId="1" w16cid:durableId="885873575">
     <w:abstractNumId w:val="4"/>
   </w:num>
-  <w:num w:numId="2" w16cid:durableId="265189740">
+  <w:num w:numId="2" w16cid:durableId="1448039383">
     <w:abstractNumId w:val="14"/>
   </w:num>
-  <w:num w:numId="3" w16cid:durableId="1709915682">
+  <w:num w:numId="3" w16cid:durableId="617028898">
     <w:abstractNumId w:val="13"/>
   </w:num>
-  <w:num w:numId="4" w16cid:durableId="1849755948">
+  <w:num w:numId="4" w16cid:durableId="1755125230">
     <w:abstractNumId w:val="2"/>
   </w:num>
-  <w:num w:numId="5" w16cid:durableId="438378614">
+  <w:num w:numId="5" w16cid:durableId="23024771">
     <w:abstractNumId w:val="8"/>
   </w:num>
-  <w:num w:numId="6" w16cid:durableId="190725702">
+  <w:num w:numId="6" w16cid:durableId="1635714394">
     <w:abstractNumId w:val="7"/>
   </w:num>
-  <w:num w:numId="7" w16cid:durableId="1336152614">
+  <w:num w:numId="7" w16cid:durableId="262350380">
     <w:abstractNumId w:val="3"/>
   </w:num>
-  <w:num w:numId="8" w16cid:durableId="1797485010">
+  <w:num w:numId="8" w16cid:durableId="772280977">
     <w:abstractNumId w:val="1"/>
   </w:num>
-  <w:num w:numId="9" w16cid:durableId="1300763857">
+  <w:num w:numId="9" w16cid:durableId="1905528295">
     <w:abstractNumId w:val="11"/>
   </w:num>
-  <w:num w:numId="10" w16cid:durableId="1569724334">
+  <w:num w:numId="10" w16cid:durableId="2099212808">
     <w:abstractNumId w:val="10"/>
   </w:num>
-  <w:num w:numId="11" w16cid:durableId="681979730">
+  <w:num w:numId="11" w16cid:durableId="1662393873">
     <w:abstractNumId w:val="12"/>
   </w:num>
-  <w:num w:numId="12" w16cid:durableId="595092379">
+  <w:num w:numId="12" w16cid:durableId="877207844">
     <w:abstractNumId w:val="6"/>
   </w:num>
-  <w:num w:numId="13" w16cid:durableId="168453287">
+  <w:num w:numId="13" w16cid:durableId="132332960">
     <w:abstractNumId w:val="5"/>
   </w:num>
-  <w:num w:numId="14" w16cid:durableId="936671232">
+  <w:num w:numId="14" w16cid:durableId="1839147695">
     <w:abstractNumId w:val="0"/>
   </w:num>
-  <w:num w:numId="15" w16cid:durableId="1944877363">
+  <w:num w:numId="15" w16cid:durableId="849223248">
     <w:abstractNumId w:val="9"/>
   </w:num>
 </w:numbering>
 </file>
 
 <file path=word/styles.xml><?xml version="1.0" encoding="utf-8"?>
-<w:styles xmlns:mc="http://schemas.openxmlformats.org/markup-compatibility/2006" xmlns:r="http://schemas.openxmlformats.org/officeDocument/2006/relationships" xmlns:w="http://schemas.openxmlformats.org/wordprocessingml/2006/main" xmlns:w14="http://schemas.microsoft.com/office/word/2010/wordml" xmlns:w15="http://schemas.microsoft.com/office/word/2012/wordml" xmlns:w16cex="http://schemas.microsoft.com/office/word/2018/wordml/cex" xmlns:w16cid="http://schemas.microsoft.com/office/word/2016/wordml/cid" xmlns:w16="http://schemas.microsoft.com/office/word/2018/wordml" xmlns:w16du="http://schemas.microsoft.com/office/word/2023/wordml/word16du" xmlns:w16sdtdh="http://schemas.microsoft.com/office/word/2020/wordml/sdtdatahash" xmlns:w16sdtfl="http://schemas.microsoft.com/office/word/2024/wordml/sdtformatlock" xmlns:w16se="http://schemas.microsoft.com/office/word/2015/wordml/symex" mc:Ignorable="w14 w15 w16se w16cid w16 w16cex w16sdtdh w16sdtfl w16du">
+<w:styles xmlns:mc="http://schemas.openxmlformats.org/markup-compatibility/2006" xmlns:r="http://schemas.openxmlformats.org/officeDocument/2006/relationships" xmlns:w="http://schemas.openxmlformats.org/wordprocessingml/2006/main" xmlns:w14="http://schemas.microsoft.com/office/word/2010/wordml" xmlns:w15="http://schemas.microsoft.com/office/word/2012/wordml" xmlns:w16cex="http://schemas.microsoft.com/office/word/2018/wordml/cex" xmlns:w16cid="http://schemas.microsoft.com/office/word/2016/wordml/cid" xmlns:w16="http://schemas.microsoft.com/office/word/2018/wordml" xmlns:w16sdtdh="http://schemas.microsoft.com/office/word/2020/wordml/sdtdatahash" xmlns:w16se="http://schemas.microsoft.com/office/word/2015/wordml/symex" mc:Ignorable="w14 w15 w16se w16cid w16 w16cex w16sdtdh">
   <w:docDefaults>
     <w:rPrDefault>
       <w:rPr>
@@ -11656,6 +12185,22 @@
       <w:lang w:val="es-ES_tradnl" w:eastAsia="es-ES"/>
     </w:rPr>
   </w:style>
+  <w:style w:type="table" w:styleId="TableGrid">
+    <w:name w:val="Table Grid"/>
+    <w:basedOn w:val="TableNormal"/>
+    <w:uiPriority w:val="39"/>
+    <w:rsid w:val="00B70836"/>
+    <w:tblPr>
+      <w:tblBorders>
+        <w:top w:val="single" w:sz="4" w:space="0" w:color="auto"/>
+        <w:left w:val="single" w:sz="4" w:space="0" w:color="auto"/>
+        <w:bottom w:val="single" w:sz="4" w:space="0" w:color="auto"/>
+        <w:right w:val="single" w:sz="4" w:space="0" w:color="auto"/>
+        <w:insideH w:val="single" w:sz="4" w:space="0" w:color="auto"/>
+        <w:insideV w:val="single" w:sz="4" w:space="0" w:color="auto"/>
+      </w:tblBorders>
+    </w:tblPr>
+  </w:style>
 </w:styles>
 </file>
 
@@ -11865,6 +12410,13 @@
         </a:gradFill>
       </a:fillStyleLst>
       <a:lnStyleLst>
+        <a:ln w="6350" cap="flat" cmpd="sng" algn="ctr">
+          <a:solidFill>
+            <a:schemeClr val="phClr"/>
+          </a:solidFill>
+          <a:prstDash val="solid"/>
+          <a:miter lim="800000"/>
+        </a:ln>
         <a:ln w="12700" cap="flat" cmpd="sng" algn="ctr">
           <a:solidFill>
             <a:schemeClr val="phClr"/>
@@ -11873,13 +12425,6 @@
           <a:miter lim="800000"/>
         </a:ln>
         <a:ln w="19050" cap="flat" cmpd="sng" algn="ctr">
-          <a:solidFill>
-            <a:schemeClr val="phClr"/>
-          </a:solidFill>
-          <a:prstDash val="solid"/>
-          <a:miter lim="800000"/>
-        </a:ln>
-        <a:ln w="25400" cap="flat" cmpd="sng" algn="ctr">
           <a:solidFill>
             <a:schemeClr val="phClr"/>
           </a:solidFill>
@@ -11944,27 +12489,7 @@
       </a:bgFillStyleLst>
     </a:fmtScheme>
   </a:themeElements>
-  <a:objectDefaults>
-    <a:lnDef>
-      <a:spPr/>
-      <a:bodyPr/>
-      <a:lstStyle/>
-      <a:style>
-        <a:lnRef idx="2">
-          <a:schemeClr val="accent1"/>
-        </a:lnRef>
-        <a:fillRef idx="0">
-          <a:schemeClr val="accent1"/>
-        </a:fillRef>
-        <a:effectRef idx="1">
-          <a:schemeClr val="accent1"/>
-        </a:effectRef>
-        <a:fontRef idx="minor">
-          <a:schemeClr val="tx1"/>
-        </a:fontRef>
-      </a:style>
-    </a:lnDef>
-  </a:objectDefaults>
+  <a:objectDefaults/>
   <a:extraClrSchemeLst/>
   <a:extLst>
     <a:ext uri="{05A4C25C-085E-4340-85A3-A5531E510DB2}">
@@ -11979,7 +12504,7 @@
 </file>
 
 <file path=customXml/itemProps1.xml><?xml version="1.0" encoding="utf-8"?>
-<ds:datastoreItem xmlns:ds="http://schemas.openxmlformats.org/officeDocument/2006/customXml" ds:itemID="{A9107638-37CF-490D-857A-DFAEBCDEB9DB}">
+<ds:datastoreItem xmlns:ds="http://schemas.openxmlformats.org/officeDocument/2006/customXml" ds:itemID="{F1B39DA9-589A-468F-9E39-BF6661A17131}">
   <ds:schemaRefs>
     <ds:schemaRef ds:uri="http://schemas.openxmlformats.org/officeDocument/2006/bibliography"/>
   </ds:schemaRefs>

</xml_diff>